<commit_message>
v1.1 Fix : keyboard doesn't work until I reconnect it
Je sauvegarde mes fichiers .uf2, ça peut servir
</commit_message>
<xml_diff>
--- a/0 - Configuration clavier Sofle Choc/Readme mes instructions et notes pour build et flash mon Sofle Choc - aout 2025.docx
+++ b/0 - Configuration clavier Sofle Choc/Readme mes instructions et notes pour build et flash mon Sofle Choc - aout 2025.docx
@@ -1,3 +1,2912 @@
+
+<file path=word/document.xml><?xml version="1.0" encoding="utf-8"?>
+<w:document xmlns:wpc="http://schemas.microsoft.com/office/word/2010/wordprocessingCanvas" xmlns:cx="http://schemas.microsoft.com/office/drawing/2014/chartex" xmlns:cx1="http://schemas.microsoft.com/office/drawing/2015/9/8/chartex" xmlns:cx2="http://schemas.microsoft.com/office/drawing/2015/10/21/chartex" xmlns:cx3="http://schemas.microsoft.com/office/drawing/2016/5/9/chartex" xmlns:cx4="http://schemas.microsoft.com/office/drawing/2016/5/10/chartex" xmlns:cx5="http://schemas.microsoft.com/office/drawing/2016/5/11/chartex" xmlns:cx6="http://schemas.microsoft.com/office/drawing/2016/5/12/chartex" xmlns:cx7="http://schemas.microsoft.com/office/drawing/2016/5/13/chartex" xmlns:cx8="http://schemas.microsoft.com/office/drawing/2016/5/14/chartex" xmlns:mc="http://schemas.openxmlformats.org/markup-compatibility/2006" xmlns:aink="http://schemas.microsoft.com/office/drawing/2016/ink" xmlns:am3d="http://schemas.microsoft.com/office/drawing/2017/model3d" xmlns:o="urn:schemas-microsoft-com:office:office" xmlns:r="http://schemas.openxmlformats.org/officeDocument/2006/relationships" xmlns:m="http://schemas.openxmlformats.org/officeDocument/2006/math" xmlns:v="urn:schemas-microsoft-com:vml" xmlns:wp14="http://schemas.microsoft.com/office/word/2010/wordprocessingDrawing" xmlns:wp="http://schemas.openxmlformats.org/drawingml/2006/wordprocessingDrawing" xmlns:w10="urn:schemas-microsoft-com:office:word" xmlns:w="http://schemas.openxmlformats.org/wordprocessingml/2006/main" xmlns:w14="http://schemas.microsoft.com/office/word/2010/wordml" xmlns:w15="http://schemas.microsoft.com/office/word/2012/wordml" xmlns:w16cex="http://schemas.microsoft.com/office/word/2018/wordml/cex" xmlns:w16cid="http://schemas.microsoft.com/office/word/2016/wordml/cid" xmlns:w16="http://schemas.microsoft.com/office/word/2018/wordml" xmlns:w16sdtdh="http://schemas.microsoft.com/office/word/2020/wordml/sdtdatahash" xmlns:w16se="http://schemas.microsoft.com/office/word/2015/wordml/symex" xmlns:wpg="http://schemas.microsoft.com/office/word/2010/wordprocessingGroup" xmlns:wpi="http://schemas.microsoft.com/office/word/2010/wordprocessingInk" xmlns:wne="http://schemas.microsoft.com/office/word/2006/wordml" xmlns:wps="http://schemas.microsoft.com/office/word/2010/wordprocessingShape" mc:Ignorable="w14 w15 w16se w16cid w16 w16cex w16sdtdh wp14">
+  <w:body>
+    <w:p>
+      <w:pPr>
+        <w:pStyle w:val="Titre1"/>
+      </w:pPr>
+      <w:r>
+        <w:t>Infos</w:t>
+      </w:r>
+    </w:p>
+    <w:p>
+      <w:r>
+        <w:rPr>
+          <w:b/>
+          <w:bCs/>
+        </w:rPr>
+        <w:t>Le mode bootloader</w:t>
+      </w:r>
+      <w:r>
+        <w:t xml:space="preserve"> monte un lecteur USB appelé </w:t>
+      </w:r>
+      <w:r>
+        <w:t>RPI-RP2.</w:t>
+      </w:r>
+    </w:p>
+    <w:p>
+      <w:r>
+        <w:t xml:space="preserve">Pour le flasher </w:t>
+      </w:r>
+      <w:r>
+        <w:t xml:space="preserve">il faut un </w:t>
+      </w:r>
+      <w:r>
+        <w:rPr>
+          <w:b/>
+          <w:bCs/>
+        </w:rPr>
+        <w:t>fichier</w:t>
+      </w:r>
+      <w:r>
+        <w:rPr>
+          <w:b/>
+          <w:bCs/>
+        </w:rPr>
+        <w:t xml:space="preserve"> </w:t>
+      </w:r>
+      <w:r>
+        <w:t>.uf2</w:t>
+      </w:r>
+      <w:r>
+        <w:t xml:space="preserve"> spécial RP2040 qu’il suffit de glisser déposer. </w:t>
+      </w:r>
+      <w:proofErr w:type="spellStart"/>
+      <w:r>
+        <w:t>Répeter</w:t>
+      </w:r>
+      <w:proofErr w:type="spellEnd"/>
+      <w:r>
+        <w:t xml:space="preserve"> l’opération pour chaque partie du clavier. Pour éviter toute erreur il vaut mieux d’abord brancher un clavier, le flasher, le débrancher, puis répéter l’opération pour le deuxième. Attention à bien faire le branchage des 2 claviers entre eux avec le câble TRRS uniquement lorsqu’il n’y a pas de courant, donc débrancher </w:t>
+      </w:r>
+      <w:proofErr w:type="spellStart"/>
+      <w:r>
+        <w:t>l’usb</w:t>
+      </w:r>
+      <w:proofErr w:type="spellEnd"/>
+      <w:r>
+        <w:t xml:space="preserve"> avant toute manipulation !</w:t>
+      </w:r>
+    </w:p>
+    <w:p>
+      <w:r>
+        <w:t xml:space="preserve">La configuration par défaut de QMK pour un clavier split est que le clavier maître est le clavier gauche, le clavier esclave est le clavier droit. Si je branche mon câble USB sur le clavier droit je vais donc avoir un clavier qui fonctionne en miroir. Si je souhaite que ça fonctionne en branchant n’importe quel clavier il faut </w:t>
+      </w:r>
+      <w:proofErr w:type="spellStart"/>
+      <w:r>
+        <w:t>build</w:t>
+      </w:r>
+      <w:proofErr w:type="spellEnd"/>
+      <w:r>
+        <w:t xml:space="preserve"> et flash avec une option différente : </w:t>
+      </w:r>
+    </w:p>
+    <w:p>
+      <w:pPr>
+        <w:pStyle w:val="Titre1"/>
+      </w:pPr>
+      <w:r>
+        <w:t>Premières étapes</w:t>
+      </w:r>
+    </w:p>
+    <w:p>
+      <w:r>
+        <w:t xml:space="preserve">Télécharger le dépôt </w:t>
+      </w:r>
+      <w:proofErr w:type="spellStart"/>
+      <w:r>
+        <w:t>vial-qmk</w:t>
+      </w:r>
+      <w:proofErr w:type="spellEnd"/>
+      <w:r>
+        <w:t xml:space="preserve"> : </w:t>
+      </w:r>
+      <w:r>
+        <w:t>https://github.com/vial-kb/vial-qmk/tree/vial</w:t>
+      </w:r>
+    </w:p>
+    <w:p>
+      <w:r>
+        <w:t xml:space="preserve">Installer QMK CLI (QMK MSYS sur </w:t>
+      </w:r>
+      <w:proofErr w:type="spellStart"/>
+      <w:r>
+        <w:t>windows</w:t>
+      </w:r>
+      <w:proofErr w:type="spellEnd"/>
+      <w:r>
+        <w:t>)</w:t>
+      </w:r>
+      <w:r>
+        <w:t xml:space="preserve">, il faut installer les </w:t>
+      </w:r>
+      <w:proofErr w:type="spellStart"/>
+      <w:r>
+        <w:t>submodules</w:t>
+      </w:r>
+      <w:proofErr w:type="spellEnd"/>
+      <w:r>
+        <w:t xml:space="preserve"> (sinon il faudra les télécharger plus tard, </w:t>
+      </w:r>
+      <w:r>
+        <w:t xml:space="preserve">git </w:t>
+      </w:r>
+      <w:proofErr w:type="spellStart"/>
+      <w:r>
+        <w:t>submodule</w:t>
+      </w:r>
+      <w:proofErr w:type="spellEnd"/>
+      <w:r>
+        <w:t xml:space="preserve"> update --init --</w:t>
+      </w:r>
+      <w:proofErr w:type="spellStart"/>
+      <w:r>
+        <w:t>recursive</w:t>
+      </w:r>
+      <w:proofErr w:type="spellEnd"/>
+    </w:p>
+    <w:p>
+      <w:r>
+        <w:t>Se placer dans le dépôt télécharger, à la racine du projet.</w:t>
+      </w:r>
+    </w:p>
+    <w:p>
+      <w:pPr>
+        <w:rPr>
+          <w:lang w:val="en-US"/>
+        </w:rPr>
+      </w:pPr>
+      <w:r>
+        <w:rPr>
+          <w:lang w:val="en-US"/>
+        </w:rPr>
+        <w:t>cd '/d/20 - Dev/vial-</w:t>
+      </w:r>
+      <w:proofErr w:type="spellStart"/>
+      <w:r>
+        <w:rPr>
+          <w:lang w:val="en-US"/>
+        </w:rPr>
+        <w:t>qmk</w:t>
+      </w:r>
+      <w:proofErr w:type="spellEnd"/>
+      <w:r>
+        <w:rPr>
+          <w:lang w:val="en-US"/>
+        </w:rPr>
+        <w:t>'</w:t>
+      </w:r>
+    </w:p>
+    <w:p>
+      <w:pPr>
+        <w:pStyle w:val="Titre2"/>
+      </w:pPr>
+      <w:r>
+        <w:t xml:space="preserve">Fichiers </w:t>
+      </w:r>
+      <w:proofErr w:type="spellStart"/>
+      <w:r>
+        <w:t>vial.json</w:t>
+      </w:r>
+      <w:proofErr w:type="spellEnd"/>
+    </w:p>
+    <w:p>
+      <w:r>
+        <w:t>J’ai désactivé l’éclairage vu q</w:t>
+      </w:r>
+      <w:r>
+        <w:t>u’il n’est pas installé et que ça posait problème.</w:t>
+      </w:r>
+    </w:p>
+    <w:p>
+      <w:pPr>
+        <w:rPr>
+          <w:lang w:val="en-US"/>
+        </w:rPr>
+      </w:pPr>
+      <w:proofErr w:type="spellStart"/>
+      <w:r>
+        <w:rPr>
+          <w:lang w:val="en-US"/>
+        </w:rPr>
+        <w:t>J’ai</w:t>
+      </w:r>
+      <w:proofErr w:type="spellEnd"/>
+      <w:r>
+        <w:rPr>
+          <w:lang w:val="en-US"/>
+        </w:rPr>
+        <w:t xml:space="preserve"> </w:t>
+      </w:r>
+      <w:proofErr w:type="spellStart"/>
+      <w:r>
+        <w:rPr>
+          <w:lang w:val="en-US"/>
+        </w:rPr>
+        <w:t>remplacé</w:t>
+      </w:r>
+      <w:proofErr w:type="spellEnd"/>
+      <w:r>
+        <w:rPr>
+          <w:lang w:val="en-US"/>
+        </w:rPr>
+        <w:t xml:space="preserve"> </w:t>
+      </w:r>
+    </w:p>
+    <w:p>
+      <w:pPr>
+        <w:rPr>
+          <w:lang w:val="en-US"/>
+        </w:rPr>
+      </w:pPr>
+      <w:r>
+        <w:rPr>
+          <w:lang w:val="en-US"/>
+        </w:rPr>
+        <w:t>"lighting": "</w:t>
+      </w:r>
+      <w:proofErr w:type="spellStart"/>
+      <w:r>
+        <w:rPr>
+          <w:lang w:val="en-US"/>
+        </w:rPr>
+        <w:t>vialrgb</w:t>
+      </w:r>
+      <w:proofErr w:type="spellEnd"/>
+      <w:r>
+        <w:rPr>
+          <w:lang w:val="en-US"/>
+        </w:rPr>
+        <w:t>",</w:t>
+      </w:r>
+    </w:p>
+    <w:p>
+      <w:pPr>
+        <w:rPr>
+          <w:lang w:val="en-US"/>
+        </w:rPr>
+      </w:pPr>
+      <w:r>
+        <w:rPr>
+          <w:lang w:val="en-US"/>
+        </w:rPr>
+        <w:t>Par :</w:t>
+      </w:r>
+    </w:p>
+    <w:p>
+      <w:pPr>
+        <w:rPr>
+          <w:lang w:val="en-US"/>
+        </w:rPr>
+      </w:pPr>
+      <w:r>
+        <w:rPr>
+          <w:lang w:val="en-US"/>
+        </w:rPr>
+        <w:t>"lighting": "none",</w:t>
+      </w:r>
+    </w:p>
+    <w:p>
+      <w:pPr>
+        <w:pStyle w:val="Titre2"/>
+        <w:rPr>
+          <w:lang w:val="en-US"/>
+        </w:rPr>
+      </w:pPr>
+      <w:proofErr w:type="spellStart"/>
+      <w:r>
+        <w:rPr>
+          <w:lang w:val="en-US"/>
+        </w:rPr>
+        <w:t>Fichier</w:t>
+      </w:r>
+      <w:proofErr w:type="spellEnd"/>
+      <w:r>
+        <w:rPr>
+          <w:lang w:val="en-US"/>
+        </w:rPr>
+        <w:t xml:space="preserve"> rules.mk</w:t>
+      </w:r>
+    </w:p>
+    <w:p>
+      <w:pPr>
+        <w:rPr>
+          <w:lang w:val="en-US"/>
+        </w:rPr>
+      </w:pPr>
+      <w:r>
+        <w:rPr>
+          <w:lang w:val="en-US"/>
+        </w:rPr>
+        <w:t xml:space="preserve">Le </w:t>
+      </w:r>
+      <w:proofErr w:type="spellStart"/>
+      <w:r>
+        <w:rPr>
+          <w:lang w:val="en-US"/>
+        </w:rPr>
+        <w:t>fichier</w:t>
+      </w:r>
+      <w:proofErr w:type="spellEnd"/>
+      <w:r>
+        <w:rPr>
+          <w:lang w:val="en-US"/>
+        </w:rPr>
+        <w:t xml:space="preserve"> </w:t>
+      </w:r>
+      <w:proofErr w:type="spellStart"/>
+      <w:r>
+        <w:rPr>
+          <w:lang w:val="en-US"/>
+        </w:rPr>
+        <w:t>d’origine</w:t>
+      </w:r>
+      <w:proofErr w:type="spellEnd"/>
+      <w:r>
+        <w:rPr>
+          <w:lang w:val="en-US"/>
+        </w:rPr>
+        <w:t xml:space="preserve"> :</w:t>
+      </w:r>
+    </w:p>
+    <w:p>
+      <w:pPr>
+        <w:rPr>
+          <w:lang w:val="en-US"/>
+        </w:rPr>
+      </w:pPr>
+      <w:r>
+        <w:rPr>
+          <w:lang w:val="en-US"/>
+        </w:rPr>
+        <w:t>OLED_ENABLE = no</w:t>
+      </w:r>
+    </w:p>
+    <w:p>
+      <w:pPr>
+        <w:rPr>
+          <w:lang w:val="en-US"/>
+        </w:rPr>
+      </w:pPr>
+      <w:r>
+        <w:rPr>
+          <w:lang w:val="en-US"/>
+        </w:rPr>
+        <w:t>ENCODER_ENABLE = no</w:t>
+      </w:r>
+    </w:p>
+    <w:p>
+      <w:pPr>
+        <w:rPr>
+          <w:lang w:val="en-US"/>
+        </w:rPr>
+      </w:pPr>
+      <w:r>
+        <w:rPr>
+          <w:lang w:val="en-US"/>
+        </w:rPr>
+        <w:t>CONSOLE_ENABLE = no</w:t>
+      </w:r>
+    </w:p>
+    <w:p>
+      <w:pPr>
+        <w:rPr>
+          <w:lang w:val="en-US"/>
+        </w:rPr>
+      </w:pPr>
+      <w:r>
+        <w:rPr>
+          <w:lang w:val="en-US"/>
+        </w:rPr>
+        <w:t>EXTRAKEY_ENABLE = no</w:t>
+      </w:r>
+    </w:p>
+    <w:p>
+      <w:pPr>
+        <w:rPr>
+          <w:lang w:val="en-US"/>
+        </w:rPr>
+      </w:pPr>
+      <w:r>
+        <w:rPr>
+          <w:lang w:val="en-US"/>
+        </w:rPr>
+        <w:t>VIA_ENABLE = yes</w:t>
+      </w:r>
+    </w:p>
+    <w:p>
+      <w:pPr>
+        <w:rPr>
+          <w:lang w:val="en-US"/>
+        </w:rPr>
+      </w:pPr>
+      <w:r>
+        <w:rPr>
+          <w:lang w:val="en-US"/>
+        </w:rPr>
+        <w:t>VIAL_ENABLE = yes</w:t>
+      </w:r>
+    </w:p>
+    <w:p>
+      <w:pPr>
+        <w:rPr>
+          <w:lang w:val="en-US"/>
+        </w:rPr>
+      </w:pPr>
+      <w:r>
+        <w:rPr>
+          <w:lang w:val="en-US"/>
+        </w:rPr>
+        <w:t>ENCODER_MAP_ENABLE = no</w:t>
+      </w:r>
+    </w:p>
+    <w:p>
+      <w:pPr>
+        <w:rPr>
+          <w:lang w:val="en-US"/>
+        </w:rPr>
+      </w:pPr>
+      <w:r>
+        <w:rPr>
+          <w:lang w:val="en-US"/>
+        </w:rPr>
+        <w:t>LTO_ENABLE = no</w:t>
+      </w:r>
+    </w:p>
+    <w:p>
+      <w:pPr>
+        <w:rPr>
+          <w:lang w:val="en-US"/>
+        </w:rPr>
+      </w:pPr>
+      <w:r>
+        <w:rPr>
+          <w:lang w:val="en-US"/>
+        </w:rPr>
+        <w:t>BACKLIGHT_ENABLE = no</w:t>
+      </w:r>
+    </w:p>
+    <w:p>
+      <w:pPr>
+        <w:rPr>
+          <w:lang w:val="en-US"/>
+        </w:rPr>
+      </w:pPr>
+      <w:r>
+        <w:rPr>
+          <w:lang w:val="en-US"/>
+        </w:rPr>
+        <w:lastRenderedPageBreak/>
+        <w:t>RGBLIGHT_ENABLE = no</w:t>
+      </w:r>
+    </w:p>
+    <w:p>
+      <w:pPr>
+        <w:rPr>
+          <w:lang w:val="en-US"/>
+        </w:rPr>
+      </w:pPr>
+      <w:r>
+        <w:rPr>
+          <w:lang w:val="en-US"/>
+        </w:rPr>
+        <w:t>VIALRGB_ENABLE = no</w:t>
+      </w:r>
+    </w:p>
+    <w:p>
+      <w:pPr>
+        <w:rPr>
+          <w:lang w:val="en-US"/>
+        </w:rPr>
+      </w:pPr>
+      <w:r>
+        <w:rPr>
+          <w:lang w:val="en-US"/>
+        </w:rPr>
+        <w:t>QMK_SETTINGS = no</w:t>
+      </w:r>
+    </w:p>
+    <w:p>
+      <w:pPr>
+        <w:rPr>
+          <w:lang w:val="en-US"/>
+        </w:rPr>
+      </w:pPr>
+      <w:r>
+        <w:rPr>
+          <w:lang w:val="en-US"/>
+        </w:rPr>
+        <w:t>MOUSEKEY_ENABLE = no</w:t>
+      </w:r>
+    </w:p>
+    <w:p>
+      <w:pPr>
+        <w:rPr>
+          <w:lang w:val="en-US"/>
+        </w:rPr>
+      </w:pPr>
+      <w:r>
+        <w:rPr>
+          <w:lang w:val="en-US"/>
+        </w:rPr>
+        <w:t>COMBO_ENABLE = no</w:t>
+      </w:r>
+    </w:p>
+    <w:p>
+      <w:pPr>
+        <w:rPr>
+          <w:lang w:val="en-US"/>
+        </w:rPr>
+      </w:pPr>
+      <w:r>
+        <w:rPr>
+          <w:lang w:val="en-US"/>
+        </w:rPr>
+        <w:t>KEY_OVERRIDE_ENABLE = no</w:t>
+      </w:r>
+    </w:p>
+    <w:p>
+      <w:r>
+        <w:t>RGB_MATRIX_ENABLE = no</w:t>
+      </w:r>
+    </w:p>
+    <w:p/>
+    <w:p>
+      <w:r>
+        <w:t xml:space="preserve">Que j’ai remplacé par : </w:t>
+      </w:r>
+    </w:p>
+    <w:p>
+      <w:pPr>
+        <w:rPr>
+          <w:lang w:val="en-US"/>
+        </w:rPr>
+      </w:pPr>
+      <w:r>
+        <w:rPr>
+          <w:lang w:val="en-US"/>
+        </w:rPr>
+        <w:t>LTO_ENABLE = yes</w:t>
+      </w:r>
+    </w:p>
+    <w:p>
+      <w:pPr>
+        <w:rPr>
+          <w:lang w:val="en-US"/>
+        </w:rPr>
+      </w:pPr>
+      <w:r>
+        <w:rPr>
+          <w:lang w:val="en-US"/>
+        </w:rPr>
+        <w:t>OLED_ENABLE = no</w:t>
+      </w:r>
+    </w:p>
+    <w:p>
+      <w:pPr>
+        <w:rPr>
+          <w:lang w:val="en-US"/>
+        </w:rPr>
+      </w:pPr>
+      <w:r>
+        <w:rPr>
+          <w:lang w:val="en-US"/>
+        </w:rPr>
+        <w:t>ENCODER_ENABLE = yes</w:t>
+      </w:r>
+    </w:p>
+    <w:p>
+      <w:pPr>
+        <w:rPr>
+          <w:lang w:val="en-US"/>
+        </w:rPr>
+      </w:pPr>
+      <w:r>
+        <w:rPr>
+          <w:lang w:val="en-US"/>
+        </w:rPr>
+        <w:t>CONSOLE_ENABLE = no</w:t>
+      </w:r>
+    </w:p>
+    <w:p>
+      <w:pPr>
+        <w:rPr>
+          <w:lang w:val="en-US"/>
+        </w:rPr>
+      </w:pPr>
+      <w:r>
+        <w:rPr>
+          <w:lang w:val="en-US"/>
+        </w:rPr>
+        <w:t>EXTRAKEY_ENABLE = yes</w:t>
+      </w:r>
+    </w:p>
+    <w:p>
+      <w:pPr>
+        <w:rPr>
+          <w:lang w:val="en-US"/>
+        </w:rPr>
+      </w:pPr>
+      <w:r>
+        <w:rPr>
+          <w:lang w:val="en-US"/>
+        </w:rPr>
+        <w:t>VIA_ENABLE = yes</w:t>
+      </w:r>
+    </w:p>
+    <w:p>
+      <w:pPr>
+        <w:rPr>
+          <w:lang w:val="en-US"/>
+        </w:rPr>
+      </w:pPr>
+      <w:r>
+        <w:rPr>
+          <w:lang w:val="en-US"/>
+        </w:rPr>
+        <w:t>VIAL_ENABLE = yes</w:t>
+      </w:r>
+    </w:p>
+    <w:p>
+      <w:pPr>
+        <w:rPr>
+          <w:lang w:val="en-US"/>
+        </w:rPr>
+      </w:pPr>
+      <w:r>
+        <w:rPr>
+          <w:lang w:val="en-US"/>
+        </w:rPr>
+        <w:t>ENCODER_MAP_ENABLE = yes</w:t>
+      </w:r>
+    </w:p>
+    <w:p>
+      <w:pPr>
+        <w:rPr>
+          <w:lang w:val="en-US"/>
+        </w:rPr>
+      </w:pPr>
+      <w:r>
+        <w:rPr>
+          <w:lang w:val="en-US"/>
+        </w:rPr>
+        <w:t>BACKLIGHT_ENABLE = no</w:t>
+      </w:r>
+    </w:p>
+    <w:p>
+      <w:pPr>
+        <w:rPr>
+          <w:lang w:val="en-US"/>
+        </w:rPr>
+      </w:pPr>
+      <w:r>
+        <w:rPr>
+          <w:lang w:val="en-US"/>
+        </w:rPr>
+        <w:t>RGBLIGHT_ENABLE = no</w:t>
+      </w:r>
+    </w:p>
+    <w:p>
+      <w:pPr>
+        <w:rPr>
+          <w:lang w:val="en-US"/>
+        </w:rPr>
+      </w:pPr>
+      <w:r>
+        <w:rPr>
+          <w:lang w:val="en-US"/>
+        </w:rPr>
+        <w:t>VIALRGB_ENABLE = no</w:t>
+      </w:r>
+    </w:p>
+    <w:p>
+      <w:pPr>
+        <w:rPr>
+          <w:lang w:val="en-US"/>
+        </w:rPr>
+      </w:pPr>
+      <w:r>
+        <w:rPr>
+          <w:lang w:val="en-US"/>
+        </w:rPr>
+        <w:t>QMK_SETTINGS = no</w:t>
+      </w:r>
+    </w:p>
+    <w:p>
+      <w:pPr>
+        <w:rPr>
+          <w:lang w:val="en-US"/>
+        </w:rPr>
+      </w:pPr>
+      <w:r>
+        <w:rPr>
+          <w:lang w:val="en-US"/>
+        </w:rPr>
+        <w:t>MOUSEKEY_ENABLE = yes</w:t>
+      </w:r>
+    </w:p>
+    <w:p>
+      <w:pPr>
+        <w:rPr>
+          <w:lang w:val="en-US"/>
+        </w:rPr>
+      </w:pPr>
+      <w:r>
+        <w:rPr>
+          <w:lang w:val="en-US"/>
+        </w:rPr>
+        <w:t>COMBO_ENABLE = no</w:t>
+      </w:r>
+    </w:p>
+    <w:p>
+      <w:pPr>
+        <w:rPr>
+          <w:lang w:val="en-US"/>
+        </w:rPr>
+      </w:pPr>
+      <w:r>
+        <w:rPr>
+          <w:lang w:val="en-US"/>
+        </w:rPr>
+        <w:t>KEY_OVERRIDE_ENABLE = no</w:t>
+      </w:r>
+    </w:p>
+    <w:p>
+      <w:pPr>
+        <w:rPr>
+          <w:lang w:val="en-US"/>
+        </w:rPr>
+      </w:pPr>
+      <w:r>
+        <w:rPr>
+          <w:lang w:val="en-US"/>
+        </w:rPr>
+        <w:t>RGB_MATRIX_ENABLE = no</w:t>
+      </w:r>
+    </w:p>
+    <w:p>
+      <w:pPr>
+        <w:pStyle w:val="Titre3"/>
+        <w:rPr>
+          <w:lang w:val="en-US"/>
+        </w:rPr>
+      </w:pPr>
+    </w:p>
+    <w:p>
+      <w:pPr>
+        <w:pStyle w:val="Titre3"/>
+      </w:pPr>
+      <w:r>
+        <w:t>Explications</w:t>
+      </w:r>
+      <w:r>
+        <w:t xml:space="preserve"> des variables que j’ai mis à yes</w:t>
+      </w:r>
+    </w:p>
+    <w:p>
+      <w:r>
+        <w:t>ENCODER_ENABLE</w:t>
+      </w:r>
+      <w:r>
+        <w:t xml:space="preserve"> + </w:t>
+      </w:r>
+      <w:r>
+        <w:t xml:space="preserve">ENCODER_MAP_ENABLE </w:t>
+      </w:r>
+      <w:r>
+        <w:t xml:space="preserve">ces </w:t>
+      </w:r>
+      <w:proofErr w:type="spellStart"/>
+      <w:r>
+        <w:t>deux là</w:t>
+      </w:r>
+      <w:proofErr w:type="spellEnd"/>
+      <w:r>
+        <w:t xml:space="preserve"> </w:t>
+      </w:r>
+      <w:r>
+        <w:t xml:space="preserve">servent </w:t>
+      </w:r>
+      <w:r>
+        <w:t xml:space="preserve">pour les rotary </w:t>
+      </w:r>
+      <w:proofErr w:type="spellStart"/>
+      <w:r>
+        <w:t>knob</w:t>
+      </w:r>
+      <w:proofErr w:type="spellEnd"/>
+    </w:p>
+    <w:p>
+      <w:r>
+        <w:t>EXTRAKEY_ENABLE</w:t>
+      </w:r>
+      <w:r>
+        <w:t xml:space="preserve"> + </w:t>
+      </w:r>
+      <w:r>
+        <w:t>MOUSEKEY_ENABLE au cas où j’aurais envie de faire un défilement de la page.</w:t>
+      </w:r>
+    </w:p>
+    <w:p>
+      <w:r>
+        <w:t>LTO_ENABLE pour être sûr d’avoir assez de place, ça devrait marche sans</w:t>
+      </w:r>
+    </w:p>
+    <w:p/>
+    <w:p/>
+    <w:p>
+      <w:pPr>
+        <w:pStyle w:val="Titre2"/>
+      </w:pPr>
+      <w:r>
+        <w:lastRenderedPageBreak/>
+        <w:t xml:space="preserve">Fichier </w:t>
+      </w:r>
+      <w:proofErr w:type="spellStart"/>
+      <w:r>
+        <w:t>Keymap.c</w:t>
+      </w:r>
+      <w:proofErr w:type="spellEnd"/>
+    </w:p>
+    <w:p>
+      <w:r>
+        <w:t xml:space="preserve">On peut le laisser tel quel, éventuellement retester d’inverse le sens des rotary </w:t>
+      </w:r>
+      <w:proofErr w:type="spellStart"/>
+      <w:r>
+        <w:t>encoders</w:t>
+      </w:r>
+      <w:proofErr w:type="spellEnd"/>
+      <w:r>
+        <w:t xml:space="preserve"> car ils sont soudés à l’envers). Normalement ça devrait marcher en remplaçant par :</w:t>
+      </w:r>
+    </w:p>
+    <w:p>
+      <w:r>
+        <w:t>ENCODER_CCW_CW(KC_VOLU, KC_VOLD), ENCODER_CCW_CW(KC_MNXT, KC_MPRV)</w:t>
+      </w:r>
+    </w:p>
+    <w:p>
+      <w:pPr>
+        <w:pStyle w:val="Titre1"/>
+      </w:pPr>
+      <w:proofErr w:type="spellStart"/>
+      <w:r>
+        <w:t>Build</w:t>
+      </w:r>
+      <w:proofErr w:type="spellEnd"/>
+    </w:p>
+    <w:p>
+      <w:r>
+        <w:t xml:space="preserve">(si jamais on avait déjà </w:t>
+      </w:r>
+      <w:proofErr w:type="spellStart"/>
+      <w:r>
+        <w:t>build</w:t>
+      </w:r>
+      <w:proofErr w:type="spellEnd"/>
+      <w:r>
+        <w:t xml:space="preserve"> avant, </w:t>
+      </w:r>
+      <w:r>
+        <w:t xml:space="preserve">utiliser la commande </w:t>
+      </w:r>
+      <w:r>
+        <w:t>:</w:t>
+      </w:r>
+    </w:p>
+    <w:p>
+      <w:pPr>
+        <w:rPr>
+          <w:b/>
+          <w:bCs/>
+          <w:sz w:val="28"/>
+          <w:szCs w:val="28"/>
+        </w:rPr>
+      </w:pPr>
+      <w:proofErr w:type="spellStart"/>
+      <w:r>
+        <w:rPr>
+          <w:b/>
+          <w:bCs/>
+          <w:sz w:val="28"/>
+          <w:szCs w:val="28"/>
+        </w:rPr>
+        <w:t>qmk</w:t>
+      </w:r>
+      <w:proofErr w:type="spellEnd"/>
+      <w:r>
+        <w:rPr>
+          <w:b/>
+          <w:bCs/>
+          <w:sz w:val="28"/>
+          <w:szCs w:val="28"/>
+        </w:rPr>
+        <w:t xml:space="preserve"> clean -a</w:t>
+      </w:r>
+    </w:p>
+    <w:p>
+      <w:r>
+        <w:t>pour supprimer le dossier .</w:t>
+      </w:r>
+      <w:proofErr w:type="spellStart"/>
+      <w:r>
+        <w:t>build</w:t>
+      </w:r>
+      <w:proofErr w:type="spellEnd"/>
+      <w:r>
+        <w:t>/ et le fichier .uf2 à la racine</w:t>
+      </w:r>
+      <w:r>
+        <w:t>)</w:t>
+      </w:r>
+    </w:p>
+    <w:p>
+      <w:r>
+        <w:t>Ensuite faire</w:t>
+      </w:r>
+    </w:p>
+    <w:p>
+      <w:pPr>
+        <w:rPr>
+          <w:b/>
+          <w:bCs/>
+          <w:sz w:val="28"/>
+          <w:szCs w:val="28"/>
+          <w:lang w:val="en-US"/>
+        </w:rPr>
+      </w:pPr>
+      <w:proofErr w:type="spellStart"/>
+      <w:r>
+        <w:rPr>
+          <w:b/>
+          <w:bCs/>
+          <w:sz w:val="28"/>
+          <w:szCs w:val="28"/>
+          <w:lang w:val="en-US"/>
+        </w:rPr>
+        <w:t>qmk</w:t>
+      </w:r>
+      <w:proofErr w:type="spellEnd"/>
+      <w:r>
+        <w:rPr>
+          <w:b/>
+          <w:bCs/>
+          <w:sz w:val="28"/>
+          <w:szCs w:val="28"/>
+          <w:lang w:val="en-US"/>
+        </w:rPr>
+        <w:t xml:space="preserve"> compile -kb </w:t>
+      </w:r>
+      <w:proofErr w:type="spellStart"/>
+      <w:r>
+        <w:rPr>
+          <w:b/>
+          <w:bCs/>
+          <w:sz w:val="28"/>
+          <w:szCs w:val="28"/>
+          <w:lang w:val="en-US"/>
+        </w:rPr>
+        <w:t>sofle_choc</w:t>
+      </w:r>
+      <w:proofErr w:type="spellEnd"/>
+      <w:r>
+        <w:rPr>
+          <w:b/>
+          <w:bCs/>
+          <w:sz w:val="28"/>
+          <w:szCs w:val="28"/>
+          <w:lang w:val="en-US"/>
+        </w:rPr>
+        <w:t xml:space="preserve"> -km vial -e CONVERT_TO=rp2040_ce</w:t>
+      </w:r>
+    </w:p>
+    <w:p>
+      <w:r>
+        <w:t xml:space="preserve">Glisser : </w:t>
+      </w:r>
+      <w:proofErr w:type="spellStart"/>
+      <w:r>
+        <w:t>deposer</w:t>
+      </w:r>
+      <w:proofErr w:type="spellEnd"/>
+      <w:r>
+        <w:t xml:space="preserve"> le fichier </w:t>
+      </w:r>
+      <w:r>
+        <w:t xml:space="preserve">sur chaque moitié du clavier en faisant attention à ne pas débrancher/rebrancher le </w:t>
+      </w:r>
+      <w:proofErr w:type="spellStart"/>
+      <w:r>
+        <w:t>cable</w:t>
+      </w:r>
+      <w:proofErr w:type="spellEnd"/>
+      <w:r>
+        <w:t xml:space="preserve"> jack pendant que le clavier est alimenté !</w:t>
+      </w:r>
+    </w:p>
+    <w:p>
+      <w:pPr>
+        <w:pStyle w:val="whitespace-normal"/>
+        <w:pBdr>
+          <w:top w:val="single" w:sz="2" w:space="0" w:color="auto"/>
+          <w:left w:val="single" w:sz="2" w:space="0" w:color="auto"/>
+          <w:bottom w:val="single" w:sz="2" w:space="0" w:color="auto"/>
+          <w:right w:val="single" w:sz="2" w:space="0" w:color="auto"/>
+        </w:pBdr>
+        <w:shd w:val="clear" w:color="auto" w:fill="FAF9F5"/>
+        <w:spacing w:before="0" w:beforeAutospacing="0" w:after="0" w:afterAutospacing="0"/>
+        <w:rPr>
+          <w:rFonts w:ascii="Georgia" w:hAnsi="Georgia"/>
+          <w:color w:val="141413"/>
+          <w:spacing w:val="-4"/>
+          <w:sz w:val="27"/>
+          <w:szCs w:val="27"/>
+        </w:rPr>
+      </w:pPr>
+      <w:proofErr w:type="spellStart"/>
+      <w:r>
+        <w:rPr>
+          <w:rFonts w:ascii="Georgia" w:hAnsi="Georgia"/>
+          <w:color w:val="141413"/>
+          <w:spacing w:val="-4"/>
+          <w:sz w:val="27"/>
+          <w:szCs w:val="27"/>
+        </w:rPr>
+        <w:t>After</w:t>
+      </w:r>
+      <w:proofErr w:type="spellEnd"/>
+      <w:r>
+        <w:rPr>
+          <w:rFonts w:ascii="Georgia" w:hAnsi="Georgia"/>
+          <w:color w:val="141413"/>
+          <w:spacing w:val="-4"/>
+          <w:sz w:val="27"/>
+          <w:szCs w:val="27"/>
+        </w:rPr>
+        <w:t xml:space="preserve"> </w:t>
+      </w:r>
+      <w:proofErr w:type="spellStart"/>
+      <w:r>
+        <w:rPr>
+          <w:rFonts w:ascii="Georgia" w:hAnsi="Georgia"/>
+          <w:color w:val="141413"/>
+          <w:spacing w:val="-4"/>
+          <w:sz w:val="27"/>
+          <w:szCs w:val="27"/>
+        </w:rPr>
+        <w:t>compiling</w:t>
+      </w:r>
+      <w:proofErr w:type="spellEnd"/>
+      <w:r>
+        <w:rPr>
+          <w:rFonts w:ascii="Georgia" w:hAnsi="Georgia"/>
+          <w:color w:val="141413"/>
+          <w:spacing w:val="-4"/>
+          <w:sz w:val="27"/>
+          <w:szCs w:val="27"/>
+        </w:rPr>
+        <w:t>, look for:</w:t>
+      </w:r>
+    </w:p>
+    <w:p>
+      <w:pPr>
+        <w:pStyle w:val="PrformatHTML"/>
+        <w:pBdr>
+          <w:top w:val="single" w:sz="2" w:space="12" w:color="auto"/>
+          <w:left w:val="single" w:sz="2" w:space="12" w:color="auto"/>
+          <w:bottom w:val="single" w:sz="2" w:space="12" w:color="auto"/>
+          <w:right w:val="single" w:sz="2" w:space="12" w:color="auto"/>
+        </w:pBdr>
+        <w:spacing w:before="120" w:after="120"/>
+        <w:rPr>
+          <w:color w:val="383A42"/>
+          <w:spacing w:val="-4"/>
+          <w:lang w:val="en-US"/>
+        </w:rPr>
+      </w:pPr>
+      <w:r>
+        <w:rPr>
+          <w:rStyle w:val="CodeHTML"/>
+          <w:color w:val="383A42"/>
+          <w:spacing w:val="-4"/>
+          <w:bdr w:val="single" w:sz="2" w:space="0" w:color="auto" w:frame="1"/>
+        </w:rPr>
+        <w:t xml:space="preserve"> </w:t>
+      </w:r>
+      <w:r>
+        <w:rPr>
+          <w:rStyle w:val="CodeHTML"/>
+          <w:color w:val="383A42"/>
+          <w:spacing w:val="-4"/>
+          <w:bdr w:val="single" w:sz="2" w:space="0" w:color="auto" w:frame="1"/>
+          <w:lang w:val="en-US"/>
+        </w:rPr>
+        <w:t>* The firmware size is fine - 28500/28672 (99%, 172 bytes free)</w:t>
+      </w:r>
+    </w:p>
+    <w:p>
+      <w:pPr>
+        <w:pStyle w:val="whitespace-normal"/>
+        <w:pBdr>
+          <w:top w:val="single" w:sz="2" w:space="0" w:color="auto"/>
+          <w:left w:val="single" w:sz="2" w:space="0" w:color="auto"/>
+          <w:bottom w:val="single" w:sz="2" w:space="0" w:color="auto"/>
+          <w:right w:val="single" w:sz="2" w:space="0" w:color="auto"/>
+        </w:pBdr>
+        <w:shd w:val="clear" w:color="auto" w:fill="FAF9F5"/>
+        <w:spacing w:before="0" w:beforeAutospacing="0" w:after="0" w:afterAutospacing="0"/>
+        <w:rPr>
+          <w:rFonts w:ascii="Georgia" w:hAnsi="Georgia"/>
+          <w:color w:val="141413"/>
+          <w:spacing w:val="-4"/>
+          <w:sz w:val="27"/>
+          <w:szCs w:val="27"/>
+          <w:lang w:val="en-US"/>
+        </w:rPr>
+      </w:pPr>
+      <w:r>
+        <w:rPr>
+          <w:rFonts w:ascii="Georgia" w:hAnsi="Georgia"/>
+          <w:color w:val="141413"/>
+          <w:spacing w:val="-4"/>
+          <w:sz w:val="27"/>
+          <w:szCs w:val="27"/>
+          <w:lang w:val="en-US"/>
+        </w:rPr>
+        <w:t>If it's over 100%, you need to disable features!</w:t>
+      </w:r>
+    </w:p>
+    <w:p>
+      <w:pPr>
+        <w:rPr>
+          <w:lang w:val="en-US"/>
+        </w:rPr>
+      </w:pPr>
+    </w:p>
+    <w:p>
+      <w:pPr>
+        <w:pStyle w:val="Titre1"/>
+      </w:pPr>
+      <w:r>
+        <w:t>Ressources</w:t>
+      </w:r>
+    </w:p>
+    <w:p>
+      <w:r>
+        <w:t xml:space="preserve">Ma discussion </w:t>
+      </w:r>
+      <w:proofErr w:type="spellStart"/>
+      <w:r>
+        <w:t>ChatGPT</w:t>
+      </w:r>
+      <w:proofErr w:type="spellEnd"/>
+    </w:p>
+    <w:p>
+      <w:hyperlink r:id="rId5" w:history="1">
+        <w:r>
+          <w:rPr>
+            <w:rStyle w:val="Lienhypertexte"/>
+          </w:rPr>
+          <w:t>https://chatgpt.com/share/68a48b7c-e268-8006-b318-aa2a9d7b16d4</w:t>
+        </w:r>
+      </w:hyperlink>
+    </w:p>
+    <w:p>
+      <w:r>
+        <w:t>Celle du vendeur</w:t>
+      </w:r>
+    </w:p>
+    <w:p>
+      <w:hyperlink r:id="rId6" w:history="1">
+        <w:r>
+          <w:rPr>
+            <w:rStyle w:val="Lienhypertexte"/>
+          </w:rPr>
+          <w:t>https://claude.ai/share/4aa18280-53e8-4701-bb5a-d326d43d06ca</w:t>
+        </w:r>
+      </w:hyperlink>
+    </w:p>
+    <w:p>
+      <w:pPr>
+        <w:rPr>
+          <w:lang w:val="en-US"/>
+        </w:rPr>
+      </w:pPr>
+      <w:r>
+        <w:rPr>
+          <w:lang w:val="en-US"/>
+        </w:rPr>
+        <w:t>Groupe Discord - support de QMK</w:t>
+      </w:r>
+    </w:p>
+    <w:p>
+      <w:pPr>
+        <w:rPr>
+          <w:rFonts w:ascii="Noto Sans" w:hAnsi="Noto Sans" w:cs="Noto Sans"/>
+          <w:bdr w:val="none" w:sz="0" w:space="0" w:color="auto" w:frame="1"/>
+          <w:lang w:val="en-US"/>
+        </w:rPr>
+      </w:pPr>
+      <w:r>
+        <w:rPr>
+          <w:rFonts w:ascii="Noto Sans" w:hAnsi="Noto Sans" w:cs="Noto Sans"/>
+          <w:bdr w:val="none" w:sz="0" w:space="0" w:color="auto" w:frame="1"/>
+          <w:lang w:val="en-US"/>
+        </w:rPr>
+        <w:t xml:space="preserve">Unfortunately, the EEPROM flashing procedure described in that section does not work with RP2040 — it works only with AVR chips and some specific bootloaders. For RP2040 you actually need to compile two different firmware files (which </w:t>
+      </w:r>
+      <w:proofErr w:type="spellStart"/>
+      <w:r>
+        <w:rPr>
+          <w:rStyle w:val="CodeHTML"/>
+          <w:rFonts w:ascii="Source Code Pro" w:eastAsiaTheme="majorEastAsia" w:hAnsi="Source Code Pro"/>
+          <w:bdr w:val="single" w:sz="6" w:space="0" w:color="auto" w:frame="1"/>
+          <w:lang w:val="en-US"/>
+        </w:rPr>
+        <w:t>qmk</w:t>
+      </w:r>
+      <w:proofErr w:type="spellEnd"/>
+      <w:r>
+        <w:rPr>
+          <w:rStyle w:val="CodeHTML"/>
+          <w:rFonts w:ascii="Source Code Pro" w:eastAsiaTheme="majorEastAsia" w:hAnsi="Source Code Pro"/>
+          <w:bdr w:val="single" w:sz="6" w:space="0" w:color="auto" w:frame="1"/>
+          <w:lang w:val="en-US"/>
+        </w:rPr>
+        <w:t xml:space="preserve"> flash ... -bl uf2-split-left</w:t>
+      </w:r>
+      <w:r>
+        <w:rPr>
+          <w:rFonts w:ascii="Noto Sans" w:hAnsi="Noto Sans" w:cs="Noto Sans"/>
+          <w:bdr w:val="none" w:sz="0" w:space="0" w:color="auto" w:frame="1"/>
+          <w:lang w:val="en-US"/>
+        </w:rPr>
+        <w:t xml:space="preserve"> /</w:t>
+      </w:r>
+      <w:r>
+        <w:rPr>
+          <w:rStyle w:val="CodeHTML"/>
+          <w:rFonts w:ascii="Source Code Pro" w:eastAsiaTheme="majorEastAsia" w:hAnsi="Source Code Pro"/>
+          <w:bdr w:val="single" w:sz="6" w:space="0" w:color="auto" w:frame="1"/>
+          <w:lang w:val="en-US"/>
+        </w:rPr>
+        <w:t>-bl uf2-split-right</w:t>
+      </w:r>
+      <w:r>
+        <w:rPr>
+          <w:rFonts w:ascii="Noto Sans" w:hAnsi="Noto Sans" w:cs="Noto Sans"/>
+          <w:bdr w:val="none" w:sz="0" w:space="0" w:color="auto" w:frame="1"/>
+          <w:lang w:val="en-US"/>
+        </w:rPr>
+        <w:t xml:space="preserve"> does internally).</w:t>
+      </w:r>
+    </w:p>
+    <w:p>
+      <w:pPr>
+        <w:rPr>
+          <w:rFonts w:ascii="Noto Sans" w:hAnsi="Noto Sans" w:cs="Noto Sans"/>
+          <w:bdr w:val="none" w:sz="0" w:space="0" w:color="auto" w:frame="1"/>
+          <w:lang w:val="en-US"/>
+        </w:rPr>
+      </w:pPr>
+      <w:r>
+        <w:rPr>
+          <w:rFonts w:ascii="Noto Sans" w:hAnsi="Noto Sans" w:cs="Noto Sans"/>
+          <w:bdr w:val="none" w:sz="0" w:space="0" w:color="auto" w:frame="1"/>
+          <w:lang w:val="en-US"/>
+        </w:rPr>
+        <w:t xml:space="preserve">Les knob : </w:t>
+      </w:r>
+    </w:p>
+    <w:p>
+      <w:pPr>
+        <w:rPr>
+          <w:rFonts w:ascii="Noto Sans" w:hAnsi="Noto Sans" w:cs="Noto Sans"/>
+          <w:lang w:val="en-US"/>
+        </w:rPr>
+      </w:pPr>
+      <w:r>
+        <w:rPr>
+          <w:rFonts w:ascii="Noto Sans" w:hAnsi="Noto Sans" w:cs="Noto Sans"/>
+          <w:lang w:val="en-US"/>
+        </w:rPr>
+        <w:t xml:space="preserve">those look to be </w:t>
+      </w:r>
+      <w:proofErr w:type="spellStart"/>
+      <w:r>
+        <w:rPr>
+          <w:rFonts w:ascii="Noto Sans" w:hAnsi="Noto Sans" w:cs="Noto Sans"/>
+          <w:lang w:val="en-US"/>
+        </w:rPr>
+        <w:t>chinesium</w:t>
+      </w:r>
+      <w:proofErr w:type="spellEnd"/>
+      <w:r>
+        <w:rPr>
+          <w:rFonts w:ascii="Noto Sans" w:hAnsi="Noto Sans" w:cs="Noto Sans"/>
+          <w:lang w:val="en-US"/>
+        </w:rPr>
+        <w:t xml:space="preserve"> </w:t>
+      </w:r>
+      <w:proofErr w:type="spellStart"/>
+      <w:r>
+        <w:rPr>
+          <w:rFonts w:ascii="Noto Sans" w:hAnsi="Noto Sans" w:cs="Noto Sans"/>
+          <w:lang w:val="en-US"/>
+        </w:rPr>
+        <w:t>helios</w:t>
+      </w:r>
+      <w:proofErr w:type="spellEnd"/>
+      <w:r>
+        <w:rPr>
+          <w:rFonts w:ascii="Noto Sans" w:hAnsi="Noto Sans" w:cs="Noto Sans"/>
+          <w:lang w:val="en-US"/>
+        </w:rPr>
+        <w:t xml:space="preserve"> knockoffs IIRC</w:t>
+      </w:r>
+    </w:p>
+    <w:p>
+      <w:pPr>
+        <w:rPr>
+          <w:rFonts w:ascii="Noto Sans" w:hAnsi="Noto Sans" w:cs="Noto Sans"/>
+        </w:rPr>
+      </w:pPr>
+      <w:r>
+        <w:rPr>
+          <w:rFonts w:ascii="Noto Sans" w:hAnsi="Noto Sans" w:cs="Noto Sans"/>
+        </w:rPr>
+        <w:t>Le choix d</w:t>
+      </w:r>
+      <w:r>
+        <w:rPr>
+          <w:rFonts w:ascii="Noto Sans" w:hAnsi="Noto Sans" w:cs="Noto Sans"/>
+        </w:rPr>
+        <w:t xml:space="preserve">e l’option </w:t>
+      </w:r>
+      <w:proofErr w:type="spellStart"/>
+      <w:r>
+        <w:rPr>
+          <w:rFonts w:ascii="Noto Sans" w:hAnsi="Noto Sans" w:cs="Noto Sans"/>
+        </w:rPr>
+        <w:t>community</w:t>
+      </w:r>
+      <w:proofErr w:type="spellEnd"/>
+      <w:r>
+        <w:rPr>
+          <w:rFonts w:ascii="Noto Sans" w:hAnsi="Noto Sans" w:cs="Noto Sans"/>
+        </w:rPr>
+        <w:t xml:space="preserve"> </w:t>
+      </w:r>
+      <w:proofErr w:type="spellStart"/>
+      <w:r>
+        <w:rPr>
+          <w:rFonts w:ascii="Noto Sans" w:hAnsi="Noto Sans" w:cs="Noto Sans"/>
+        </w:rPr>
+        <w:t>edition</w:t>
+      </w:r>
+      <w:proofErr w:type="spellEnd"/>
+      <w:r>
+        <w:rPr>
+          <w:rFonts w:ascii="Noto Sans" w:hAnsi="Noto Sans" w:cs="Noto Sans"/>
+        </w:rPr>
+        <w:t> :</w:t>
+      </w:r>
+    </w:p>
+    <w:p>
+      <w:pPr>
+        <w:rPr>
+          <w:lang w:val="en-US"/>
+        </w:rPr>
+      </w:pPr>
+      <w:r>
+        <w:rPr>
+          <w:rFonts w:ascii="Noto Sans" w:hAnsi="Noto Sans" w:cs="Noto Sans"/>
+          <w:bdr w:val="none" w:sz="0" w:space="0" w:color="auto" w:frame="1"/>
+          <w:lang w:val="en-US"/>
+        </w:rPr>
+        <w:t xml:space="preserve">the promicro_rp2040 converter is meant explicitly for the bright red PCB version.... </w:t>
+      </w:r>
+      <w:proofErr w:type="spellStart"/>
+      <w:r>
+        <w:rPr>
+          <w:rFonts w:ascii="Noto Sans" w:hAnsi="Noto Sans" w:cs="Noto Sans"/>
+          <w:bdr w:val="none" w:sz="0" w:space="0" w:color="auto" w:frame="1"/>
+          <w:lang w:val="en-US"/>
+        </w:rPr>
+        <w:t>eg</w:t>
+      </w:r>
+      <w:proofErr w:type="spellEnd"/>
+      <w:r>
+        <w:rPr>
+          <w:rFonts w:ascii="Noto Sans" w:hAnsi="Noto Sans" w:cs="Noto Sans"/>
+          <w:bdr w:val="none" w:sz="0" w:space="0" w:color="auto" w:frame="1"/>
+          <w:lang w:val="en-US"/>
+        </w:rPr>
+        <w:t xml:space="preserve"> the official </w:t>
+      </w:r>
+      <w:proofErr w:type="spellStart"/>
+      <w:r>
+        <w:rPr>
+          <w:rFonts w:ascii="Noto Sans" w:hAnsi="Noto Sans" w:cs="Noto Sans"/>
+          <w:bdr w:val="none" w:sz="0" w:space="0" w:color="auto" w:frame="1"/>
+          <w:lang w:val="en-US"/>
+        </w:rPr>
+        <w:t>sparkfun</w:t>
+      </w:r>
+      <w:proofErr w:type="spellEnd"/>
+      <w:r>
+        <w:rPr>
+          <w:rFonts w:ascii="Noto Sans" w:hAnsi="Noto Sans" w:cs="Noto Sans"/>
+          <w:bdr w:val="none" w:sz="0" w:space="0" w:color="auto" w:frame="1"/>
+          <w:lang w:val="en-US"/>
+        </w:rPr>
+        <w:t xml:space="preserve"> </w:t>
+      </w:r>
+      <w:proofErr w:type="spellStart"/>
+      <w:r>
+        <w:rPr>
+          <w:rFonts w:ascii="Noto Sans" w:hAnsi="Noto Sans" w:cs="Noto Sans"/>
+          <w:bdr w:val="none" w:sz="0" w:space="0" w:color="auto" w:frame="1"/>
+          <w:lang w:val="en-US"/>
+        </w:rPr>
+        <w:t>promicro</w:t>
+      </w:r>
+      <w:proofErr w:type="spellEnd"/>
+      <w:r>
+        <w:rPr>
+          <w:rFonts w:ascii="Noto Sans" w:hAnsi="Noto Sans" w:cs="Noto Sans"/>
+          <w:bdr w:val="none" w:sz="0" w:space="0" w:color="auto" w:frame="1"/>
+          <w:lang w:val="en-US"/>
+        </w:rPr>
+        <w:t xml:space="preserve"> rp2040.</w:t>
+      </w:r>
+      <w:r>
+        <w:rPr>
+          <w:rFonts w:ascii="Noto Sans" w:hAnsi="Noto Sans" w:cs="Noto Sans"/>
+          <w:lang w:val="en-US"/>
+        </w:rPr>
+        <w:br/>
+      </w:r>
+      <w:r>
+        <w:rPr>
+          <w:rFonts w:ascii="Noto Sans" w:hAnsi="Noto Sans" w:cs="Noto Sans"/>
+          <w:bdr w:val="none" w:sz="0" w:space="0" w:color="auto" w:frame="1"/>
+          <w:lang w:val="en-US"/>
+        </w:rPr>
+        <w:t>The rp2040_ce is the "community edition rp2040" which is pro micro pin compatible.</w:t>
+      </w:r>
+    </w:p>
+    <w:p>
+      <w:pPr>
+        <w:rPr>
+          <w:lang w:val="en-US"/>
+        </w:rPr>
+      </w:pPr>
+    </w:p>
+    <w:p>
+      <w:pPr>
+        <w:rPr>
+          <w:lang w:val="en-US"/>
+        </w:rPr>
+      </w:pPr>
+    </w:p>
+    <w:p>
+      <w:pPr>
+        <w:rPr>
+          <w:lang w:val="en-US"/>
+        </w:rPr>
+      </w:pPr>
+      <w:proofErr w:type="spellStart"/>
+      <w:r>
+        <w:rPr>
+          <w:lang w:val="en-US"/>
+        </w:rPr>
+        <w:t>Erreur</w:t>
+      </w:r>
+      <w:proofErr w:type="spellEnd"/>
+      <w:r>
+        <w:rPr>
+          <w:lang w:val="en-US"/>
+        </w:rPr>
+        <w:t xml:space="preserve"> </w:t>
+      </w:r>
+      <w:proofErr w:type="spellStart"/>
+      <w:r>
+        <w:rPr>
+          <w:lang w:val="en-US"/>
+        </w:rPr>
+        <w:t>lors</w:t>
+      </w:r>
+      <w:proofErr w:type="spellEnd"/>
+      <w:r>
+        <w:rPr>
+          <w:lang w:val="en-US"/>
+        </w:rPr>
+        <w:t xml:space="preserve"> du build : </w:t>
+      </w:r>
+    </w:p>
+    <w:p>
+      <w:pPr>
+        <w:pStyle w:val="whitespace-pre-wrap"/>
+        <w:pBdr>
+          <w:top w:val="single" w:sz="2" w:space="0" w:color="auto"/>
+          <w:left w:val="single" w:sz="2" w:space="0" w:color="auto"/>
+          <w:bottom w:val="single" w:sz="2" w:space="0" w:color="auto"/>
+          <w:right w:val="single" w:sz="2" w:space="0" w:color="auto"/>
+        </w:pBdr>
+        <w:shd w:val="clear" w:color="auto" w:fill="F0EEE6"/>
+        <w:spacing w:before="0" w:beforeAutospacing="0" w:after="0" w:afterAutospacing="0"/>
+        <w:rPr>
+          <w:rFonts w:ascii="Segoe UI" w:hAnsi="Segoe UI" w:cs="Segoe UI"/>
+          <w:color w:val="141413"/>
+          <w:spacing w:val="-6"/>
+          <w:sz w:val="23"/>
+          <w:szCs w:val="23"/>
+          <w:lang w:val="en-US"/>
+        </w:rPr>
+      </w:pPr>
+      <w:r>
+        <w:rPr>
+          <w:rFonts w:ascii="Segoe UI" w:hAnsi="Segoe UI" w:cs="Segoe UI"/>
+          <w:color w:val="141413"/>
+          <w:spacing w:val="-6"/>
+          <w:sz w:val="23"/>
+          <w:szCs w:val="23"/>
+          <w:lang w:val="en-US"/>
+        </w:rPr>
+        <w:t xml:space="preserve">File "main_window.py", line 282, in </w:t>
+      </w:r>
+      <w:proofErr w:type="spellStart"/>
+      <w:r>
+        <w:rPr>
+          <w:rFonts w:ascii="Segoe UI" w:hAnsi="Segoe UI" w:cs="Segoe UI"/>
+          <w:color w:val="141413"/>
+          <w:spacing w:val="-6"/>
+          <w:sz w:val="23"/>
+          <w:szCs w:val="23"/>
+          <w:lang w:val="en-US"/>
+        </w:rPr>
+        <w:t>on_devices_updated</w:t>
+      </w:r>
+      <w:proofErr w:type="spellEnd"/>
+      <w:r>
+        <w:rPr>
+          <w:rFonts w:ascii="Segoe UI" w:hAnsi="Segoe UI" w:cs="Segoe UI"/>
+          <w:color w:val="141413"/>
+          <w:spacing w:val="-6"/>
+          <w:sz w:val="23"/>
+          <w:szCs w:val="23"/>
+          <w:lang w:val="en-US"/>
+        </w:rPr>
+        <w:t xml:space="preserve"> File "main_window.py", line 286, in </w:t>
+      </w:r>
+      <w:proofErr w:type="spellStart"/>
+      <w:r>
+        <w:rPr>
+          <w:rFonts w:ascii="Segoe UI" w:hAnsi="Segoe UI" w:cs="Segoe UI"/>
+          <w:color w:val="141413"/>
+          <w:spacing w:val="-6"/>
+          <w:sz w:val="23"/>
+          <w:szCs w:val="23"/>
+          <w:lang w:val="en-US"/>
+        </w:rPr>
+        <w:t>on_device_selected</w:t>
+      </w:r>
+      <w:proofErr w:type="spellEnd"/>
+      <w:r>
+        <w:rPr>
+          <w:rFonts w:ascii="Segoe UI" w:hAnsi="Segoe UI" w:cs="Segoe UI"/>
+          <w:color w:val="141413"/>
+          <w:spacing w:val="-6"/>
+          <w:sz w:val="23"/>
+          <w:szCs w:val="23"/>
+          <w:lang w:val="en-US"/>
+        </w:rPr>
+        <w:t xml:space="preserve"> File "</w:t>
+      </w:r>
+      <w:proofErr w:type="spellStart"/>
+      <w:r>
+        <w:rPr>
+          <w:rFonts w:ascii="Segoe UI" w:hAnsi="Segoe UI" w:cs="Segoe UI"/>
+          <w:color w:val="141413"/>
+          <w:spacing w:val="-6"/>
+          <w:sz w:val="23"/>
+          <w:szCs w:val="23"/>
+          <w:lang w:val="en-US"/>
+        </w:rPr>
+        <w:t>autorefresh</w:t>
+      </w:r>
+      <w:proofErr w:type="spellEnd"/>
+      <w:r>
+        <w:rPr>
+          <w:rFonts w:ascii="Segoe UI" w:hAnsi="Segoe UI" w:cs="Segoe UI"/>
+          <w:color w:val="141413"/>
+          <w:spacing w:val="-6"/>
+          <w:sz w:val="23"/>
+          <w:szCs w:val="23"/>
+          <w:lang w:val="en-US"/>
+        </w:rPr>
+        <w:t xml:space="preserve">\autorefresh.py", line 79, in </w:t>
+      </w:r>
+      <w:proofErr w:type="spellStart"/>
+      <w:r>
+        <w:rPr>
+          <w:rFonts w:ascii="Segoe UI" w:hAnsi="Segoe UI" w:cs="Segoe UI"/>
+          <w:color w:val="141413"/>
+          <w:spacing w:val="-6"/>
+          <w:sz w:val="23"/>
+          <w:szCs w:val="23"/>
+          <w:lang w:val="en-US"/>
+        </w:rPr>
+        <w:t>select_device</w:t>
+      </w:r>
+      <w:proofErr w:type="spellEnd"/>
+      <w:r>
+        <w:rPr>
+          <w:rFonts w:ascii="Segoe UI" w:hAnsi="Segoe UI" w:cs="Segoe UI"/>
+          <w:color w:val="141413"/>
+          <w:spacing w:val="-6"/>
+          <w:sz w:val="23"/>
+          <w:szCs w:val="23"/>
+          <w:lang w:val="en-US"/>
+        </w:rPr>
+        <w:t xml:space="preserve"> File "vial_device.py", line 51, in open File "protocol\keyboard_comm.py", line 83, in reload File "protocol\keyboard_comm.py", line 245, in </w:t>
+      </w:r>
+      <w:proofErr w:type="spellStart"/>
+      <w:r>
+        <w:rPr>
+          <w:rFonts w:ascii="Segoe UI" w:hAnsi="Segoe UI" w:cs="Segoe UI"/>
+          <w:color w:val="141413"/>
+          <w:spacing w:val="-6"/>
+          <w:sz w:val="23"/>
+          <w:szCs w:val="23"/>
+          <w:lang w:val="en-US"/>
+        </w:rPr>
+        <w:t>reload_persistent_rgb</w:t>
+      </w:r>
+      <w:proofErr w:type="spellEnd"/>
+    </w:p>
+    <w:p>
+      <w:pPr>
+        <w:pStyle w:val="whitespace-pre-wrap"/>
+        <w:pBdr>
+          <w:top w:val="single" w:sz="2" w:space="0" w:color="auto"/>
+          <w:left w:val="single" w:sz="2" w:space="0" w:color="auto"/>
+          <w:bottom w:val="single" w:sz="2" w:space="0" w:color="auto"/>
+          <w:right w:val="single" w:sz="2" w:space="0" w:color="auto"/>
+        </w:pBdr>
+        <w:shd w:val="clear" w:color="auto" w:fill="F0EEE6"/>
+        <w:spacing w:before="0" w:beforeAutospacing="0" w:after="0" w:afterAutospacing="0"/>
+        <w:rPr>
+          <w:rFonts w:ascii="Segoe UI" w:hAnsi="Segoe UI" w:cs="Segoe UI"/>
+          <w:color w:val="141413"/>
+          <w:spacing w:val="-6"/>
+          <w:sz w:val="23"/>
+          <w:szCs w:val="23"/>
+          <w:lang w:val="en-US"/>
+        </w:rPr>
+      </w:pPr>
+      <w:proofErr w:type="spellStart"/>
+      <w:r>
+        <w:rPr>
+          <w:rFonts w:ascii="Segoe UI" w:hAnsi="Segoe UI" w:cs="Segoe UI"/>
+          <w:color w:val="141413"/>
+          <w:spacing w:val="-6"/>
+          <w:sz w:val="23"/>
+          <w:szCs w:val="23"/>
+          <w:lang w:val="en-US"/>
+        </w:rPr>
+        <w:t>RuntimeError</w:t>
+      </w:r>
+      <w:proofErr w:type="spellEnd"/>
+      <w:r>
+        <w:rPr>
+          <w:rFonts w:ascii="Segoe UI" w:hAnsi="Segoe UI" w:cs="Segoe UI"/>
+          <w:color w:val="141413"/>
+          <w:spacing w:val="-6"/>
+          <w:sz w:val="23"/>
+          <w:szCs w:val="23"/>
+          <w:lang w:val="en-US"/>
+        </w:rPr>
+        <w:t xml:space="preserve">: Unsupported </w:t>
+      </w:r>
+      <w:proofErr w:type="spellStart"/>
+      <w:r>
+        <w:rPr>
+          <w:rFonts w:ascii="Segoe UI" w:hAnsi="Segoe UI" w:cs="Segoe UI"/>
+          <w:color w:val="141413"/>
+          <w:spacing w:val="-6"/>
+          <w:sz w:val="23"/>
+          <w:szCs w:val="23"/>
+          <w:lang w:val="en-US"/>
+        </w:rPr>
+        <w:t>VialRGB</w:t>
+      </w:r>
+      <w:proofErr w:type="spellEnd"/>
+      <w:r>
+        <w:rPr>
+          <w:rFonts w:ascii="Segoe UI" w:hAnsi="Segoe UI" w:cs="Segoe UI"/>
+          <w:color w:val="141413"/>
+          <w:spacing w:val="-6"/>
+          <w:sz w:val="23"/>
+          <w:szCs w:val="23"/>
+          <w:lang w:val="en-US"/>
+        </w:rPr>
+        <w:t xml:space="preserve"> protocol (0), update your Vial version to latest</w:t>
+      </w:r>
+    </w:p>
+    <w:p>
+      <w:pPr>
+        <w:rPr>
+          <w:lang w:val="en-US"/>
+        </w:rPr>
+      </w:pPr>
+    </w:p>
+    <w:p>
+      <w:r>
+        <w:t xml:space="preserve">Moi j’ai désactivé les </w:t>
+      </w:r>
+      <w:proofErr w:type="spellStart"/>
+      <w:r>
+        <w:t>leds</w:t>
+      </w:r>
+      <w:proofErr w:type="spellEnd"/>
+      <w:r>
+        <w:t xml:space="preserve"> :</w:t>
+      </w:r>
+    </w:p>
+    <w:p>
+      <w:r>
+        <w:t>J’avais déjà dans les options</w:t>
+      </w:r>
+    </w:p>
+    <w:p>
+      <w:pPr>
+        <w:pStyle w:val="PrformatHTML"/>
+        <w:pBdr>
+          <w:top w:val="single" w:sz="2" w:space="12" w:color="auto"/>
+          <w:left w:val="single" w:sz="2" w:space="12" w:color="auto"/>
+          <w:bottom w:val="single" w:sz="2" w:space="12" w:color="auto"/>
+          <w:right w:val="single" w:sz="2" w:space="12" w:color="auto"/>
+        </w:pBdr>
+        <w:spacing w:before="120" w:after="120"/>
+        <w:rPr>
+          <w:rStyle w:val="CodeHTML"/>
+          <w:color w:val="383A42"/>
+          <w:spacing w:val="-4"/>
+          <w:bdr w:val="single" w:sz="2" w:space="0" w:color="auto" w:frame="1"/>
+        </w:rPr>
+      </w:pPr>
+      <w:r>
+        <w:rPr>
+          <w:rStyle w:val="CodeHTML"/>
+          <w:color w:val="383A42"/>
+          <w:spacing w:val="-4"/>
+          <w:bdr w:val="single" w:sz="2" w:space="0" w:color="auto" w:frame="1"/>
+        </w:rPr>
+        <w:t>RGBLIGHT_ENABLE = no</w:t>
+      </w:r>
+    </w:p>
+    <w:p>
+      <w:pPr>
+        <w:pStyle w:val="PrformatHTML"/>
+        <w:pBdr>
+          <w:top w:val="single" w:sz="2" w:space="12" w:color="auto"/>
+          <w:left w:val="single" w:sz="2" w:space="12" w:color="auto"/>
+          <w:bottom w:val="single" w:sz="2" w:space="12" w:color="auto"/>
+          <w:right w:val="single" w:sz="2" w:space="12" w:color="auto"/>
+        </w:pBdr>
+        <w:spacing w:before="120" w:after="120"/>
+        <w:rPr>
+          <w:rStyle w:val="CodeHTML"/>
+          <w:color w:val="383A42"/>
+          <w:spacing w:val="-4"/>
+          <w:bdr w:val="single" w:sz="2" w:space="0" w:color="auto" w:frame="1"/>
+          <w:lang w:val="en-US"/>
+        </w:rPr>
+      </w:pPr>
+      <w:r>
+        <w:rPr>
+          <w:rStyle w:val="CodeHTML"/>
+          <w:color w:val="383A42"/>
+          <w:spacing w:val="-4"/>
+          <w:bdr w:val="single" w:sz="2" w:space="0" w:color="auto" w:frame="1"/>
+          <w:lang w:val="en-US"/>
+        </w:rPr>
+        <w:t>RGB_MATRIX_ENABLE = no</w:t>
+      </w:r>
+    </w:p>
+    <w:p>
+      <w:pPr>
+        <w:pStyle w:val="PrformatHTML"/>
+        <w:pBdr>
+          <w:top w:val="single" w:sz="2" w:space="12" w:color="auto"/>
+          <w:left w:val="single" w:sz="2" w:space="12" w:color="auto"/>
+          <w:bottom w:val="single" w:sz="2" w:space="12" w:color="auto"/>
+          <w:right w:val="single" w:sz="2" w:space="12" w:color="auto"/>
+        </w:pBdr>
+        <w:spacing w:before="120" w:after="120"/>
+        <w:rPr>
+          <w:color w:val="383A42"/>
+          <w:spacing w:val="-4"/>
+          <w:lang w:val="en-US"/>
+        </w:rPr>
+      </w:pPr>
+      <w:r>
+        <w:rPr>
+          <w:color w:val="383A42"/>
+          <w:spacing w:val="-4"/>
+          <w:lang w:val="en-US"/>
+        </w:rPr>
+        <w:t>VIALRGB_ENABLE = no</w:t>
+      </w:r>
+    </w:p>
+    <w:p>
+      <w:pPr>
+        <w:pStyle w:val="PrformatHTML"/>
+        <w:pBdr>
+          <w:top w:val="single" w:sz="2" w:space="12" w:color="auto"/>
+          <w:left w:val="single" w:sz="2" w:space="12" w:color="auto"/>
+          <w:bottom w:val="single" w:sz="2" w:space="12" w:color="auto"/>
+          <w:right w:val="single" w:sz="2" w:space="12" w:color="auto"/>
+        </w:pBdr>
+        <w:spacing w:before="120" w:after="120"/>
+        <w:rPr>
+          <w:color w:val="383A42"/>
+          <w:spacing w:val="-4"/>
+          <w:lang w:val="en-US"/>
+        </w:rPr>
+      </w:pPr>
+    </w:p>
+    <w:p>
+      <w:pPr>
+        <w:pStyle w:val="PrformatHTML"/>
+        <w:pBdr>
+          <w:top w:val="single" w:sz="2" w:space="12" w:color="auto"/>
+          <w:left w:val="single" w:sz="2" w:space="12" w:color="auto"/>
+          <w:bottom w:val="single" w:sz="2" w:space="12" w:color="auto"/>
+          <w:right w:val="single" w:sz="2" w:space="12" w:color="auto"/>
+        </w:pBdr>
+        <w:spacing w:before="120" w:after="120"/>
+        <w:rPr>
+          <w:color w:val="383A42"/>
+          <w:spacing w:val="-4"/>
+          <w:lang w:val="en-US"/>
+        </w:rPr>
+      </w:pPr>
+      <w:r>
+        <w:rPr>
+          <w:color w:val="383A42"/>
+          <w:spacing w:val="-4"/>
+          <w:lang w:val="en-US"/>
+        </w:rPr>
+        <w:t xml:space="preserve">Si je </w:t>
+      </w:r>
+      <w:proofErr w:type="spellStart"/>
+      <w:r>
+        <w:rPr>
+          <w:color w:val="383A42"/>
+          <w:spacing w:val="-4"/>
+          <w:lang w:val="en-US"/>
+        </w:rPr>
+        <w:t>veux</w:t>
+      </w:r>
+      <w:proofErr w:type="spellEnd"/>
+      <w:r>
+        <w:rPr>
+          <w:color w:val="383A42"/>
+          <w:spacing w:val="-4"/>
+          <w:lang w:val="en-US"/>
+        </w:rPr>
+        <w:t xml:space="preserve"> </w:t>
+      </w:r>
+      <w:proofErr w:type="spellStart"/>
+      <w:r>
+        <w:rPr>
+          <w:color w:val="383A42"/>
+          <w:spacing w:val="-4"/>
+          <w:lang w:val="en-US"/>
+        </w:rPr>
+        <w:t>rgb</w:t>
+      </w:r>
+      <w:proofErr w:type="spellEnd"/>
+      <w:r>
+        <w:rPr>
+          <w:color w:val="383A42"/>
+          <w:spacing w:val="-4"/>
+          <w:lang w:val="en-US"/>
+        </w:rPr>
+        <w:t> :</w:t>
+      </w:r>
+    </w:p>
+    <w:p>
+      <w:pPr>
+        <w:pStyle w:val="PrformatHTML"/>
+        <w:pBdr>
+          <w:top w:val="single" w:sz="2" w:space="12" w:color="auto"/>
+          <w:left w:val="single" w:sz="2" w:space="12" w:color="auto"/>
+          <w:bottom w:val="single" w:sz="2" w:space="12" w:color="auto"/>
+          <w:right w:val="single" w:sz="2" w:space="12" w:color="auto"/>
+        </w:pBdr>
+        <w:spacing w:before="120" w:after="120"/>
+        <w:rPr>
+          <w:color w:val="383A42"/>
+          <w:spacing w:val="-4"/>
+          <w:lang w:val="en-US"/>
+        </w:rPr>
+      </w:pPr>
+      <w:r>
+        <w:rPr>
+          <w:rStyle w:val="CodeHTML"/>
+          <w:color w:val="383A42"/>
+          <w:spacing w:val="-4"/>
+          <w:bdr w:val="single" w:sz="2" w:space="0" w:color="auto" w:frame="1"/>
+          <w:lang w:val="en-US"/>
+        </w:rPr>
+        <w:t>LTO_ENABLE = yes        # Change to yes for space</w:t>
+      </w:r>
+    </w:p>
+    <w:p>
+      <w:pPr>
+        <w:pStyle w:val="PrformatHTML"/>
+        <w:pBdr>
+          <w:top w:val="single" w:sz="2" w:space="12" w:color="auto"/>
+          <w:left w:val="single" w:sz="2" w:space="12" w:color="auto"/>
+          <w:bottom w:val="single" w:sz="2" w:space="12" w:color="auto"/>
+          <w:right w:val="single" w:sz="2" w:space="12" w:color="auto"/>
+        </w:pBdr>
+        <w:spacing w:before="120" w:after="120"/>
+        <w:rPr>
+          <w:rStyle w:val="CodeHTML"/>
+          <w:color w:val="383A42"/>
+          <w:spacing w:val="-4"/>
+          <w:bdr w:val="single" w:sz="2" w:space="0" w:color="auto" w:frame="1"/>
+          <w:lang w:val="en-US"/>
+        </w:rPr>
+      </w:pPr>
+      <w:r>
+        <w:rPr>
+          <w:rStyle w:val="CodeHTML"/>
+          <w:color w:val="383A42"/>
+          <w:spacing w:val="-4"/>
+          <w:bdr w:val="single" w:sz="2" w:space="0" w:color="auto" w:frame="1"/>
+          <w:lang w:val="en-US"/>
+        </w:rPr>
+        <w:t>RGBLIGHT_ENABLE = yes   # ENABLE THIS!</w:t>
+      </w:r>
+    </w:p>
+    <w:p>
+      <w:pPr>
+        <w:pStyle w:val="PrformatHTML"/>
+        <w:pBdr>
+          <w:top w:val="single" w:sz="2" w:space="12" w:color="auto"/>
+          <w:left w:val="single" w:sz="2" w:space="12" w:color="auto"/>
+          <w:bottom w:val="single" w:sz="2" w:space="12" w:color="auto"/>
+          <w:right w:val="single" w:sz="2" w:space="12" w:color="auto"/>
+        </w:pBdr>
+        <w:spacing w:before="120" w:after="120"/>
+        <w:rPr>
+          <w:rStyle w:val="CodeHTML"/>
+          <w:color w:val="383A42"/>
+          <w:spacing w:val="-4"/>
+          <w:bdr w:val="single" w:sz="2" w:space="0" w:color="auto" w:frame="1"/>
+          <w:lang w:val="en-US"/>
+        </w:rPr>
+      </w:pPr>
+      <w:r>
+        <w:rPr>
+          <w:rStyle w:val="CodeHTML"/>
+          <w:color w:val="383A42"/>
+          <w:spacing w:val="-4"/>
+          <w:bdr w:val="single" w:sz="2" w:space="0" w:color="auto" w:frame="1"/>
+          <w:lang w:val="en-US"/>
+        </w:rPr>
+        <w:t>VIALRGB_ENABLE = yes    # ENABLE THIS!</w:t>
+      </w:r>
+      <w:r>
+        <w:rPr>
+          <w:color w:val="383A42"/>
+          <w:spacing w:val="-4"/>
+          <w:bdr w:val="single" w:sz="2" w:space="0" w:color="auto" w:frame="1"/>
+          <w:lang w:val="en-US"/>
+        </w:rPr>
+        <w:t xml:space="preserve"> </w:t>
+      </w:r>
+      <w:r>
+        <w:rPr>
+          <w:color w:val="383A42"/>
+          <w:spacing w:val="-4"/>
+          <w:bdr w:val="single" w:sz="2" w:space="0" w:color="auto" w:frame="1"/>
+          <w:lang w:val="en-US"/>
+        </w:rPr>
+        <w:br/>
+      </w:r>
+    </w:p>
+    <w:p>
+      <w:pPr>
+        <w:pStyle w:val="PrformatHTML"/>
+        <w:pBdr>
+          <w:top w:val="single" w:sz="2" w:space="12" w:color="auto"/>
+          <w:left w:val="single" w:sz="2" w:space="12" w:color="auto"/>
+          <w:bottom w:val="single" w:sz="2" w:space="12" w:color="auto"/>
+          <w:right w:val="single" w:sz="2" w:space="12" w:color="auto"/>
+        </w:pBdr>
+        <w:spacing w:before="120" w:after="120"/>
+        <w:rPr>
+          <w:color w:val="383A42"/>
+          <w:spacing w:val="-4"/>
+          <w:lang w:val="en-US"/>
+        </w:rPr>
+      </w:pPr>
+      <w:r>
+        <w:rPr>
+          <w:rStyle w:val="CodeHTML"/>
+          <w:color w:val="383A42"/>
+          <w:spacing w:val="-4"/>
+          <w:bdr w:val="single" w:sz="2" w:space="0" w:color="auto" w:frame="1"/>
+          <w:lang w:val="en-US"/>
+        </w:rPr>
+        <w:t>RGB_MATRIX_ENABLE = no  # Keep no unless you have per-key RGB</w:t>
+      </w:r>
+      <w:r>
+        <w:rPr>
+          <w:rStyle w:val="CodeHTML"/>
+          <w:color w:val="383A42"/>
+          <w:spacing w:val="-4"/>
+          <w:bdr w:val="single" w:sz="2" w:space="0" w:color="auto" w:frame="1"/>
+          <w:lang w:val="en-US"/>
+        </w:rPr>
+        <w:t xml:space="preserve"> </w:t>
+      </w:r>
+      <w:r>
+        <w:rPr>
+          <w:rStyle w:val="CodeHTML"/>
+          <w:color w:val="383A42"/>
+          <w:spacing w:val="-4"/>
+          <w:bdr w:val="single" w:sz="2" w:space="0" w:color="auto" w:frame="1"/>
+          <w:lang w:val="en-US"/>
+        </w:rPr>
+        <w:t>(different from RGBLIGHT)</w:t>
+      </w:r>
+    </w:p>
+    <w:p>
+      <w:pPr>
+        <w:pStyle w:val="PrformatHTML"/>
+        <w:pBdr>
+          <w:top w:val="single" w:sz="2" w:space="12" w:color="auto"/>
+          <w:left w:val="single" w:sz="2" w:space="12" w:color="auto"/>
+          <w:bottom w:val="single" w:sz="2" w:space="12" w:color="auto"/>
+          <w:right w:val="single" w:sz="2" w:space="12" w:color="auto"/>
+        </w:pBdr>
+        <w:spacing w:before="120" w:after="120"/>
+        <w:rPr>
+          <w:color w:val="383A42"/>
+          <w:spacing w:val="-4"/>
+          <w:lang w:val="en-US"/>
+        </w:rPr>
+      </w:pPr>
+    </w:p>
+    <w:p>
+      <w:pPr>
+        <w:pStyle w:val="PrformatHTML"/>
+        <w:pBdr>
+          <w:top w:val="single" w:sz="2" w:space="12" w:color="auto"/>
+          <w:left w:val="single" w:sz="2" w:space="12" w:color="auto"/>
+          <w:bottom w:val="single" w:sz="2" w:space="12" w:color="auto"/>
+          <w:right w:val="single" w:sz="2" w:space="12" w:color="auto"/>
+        </w:pBdr>
+        <w:spacing w:before="120" w:after="120"/>
+        <w:rPr>
+          <w:color w:val="383A42"/>
+          <w:spacing w:val="-4"/>
+          <w:lang w:val="en-US"/>
+        </w:rPr>
+      </w:pPr>
+    </w:p>
+    <w:p>
+      <w:pPr>
+        <w:pStyle w:val="PrformatHTML"/>
+        <w:pBdr>
+          <w:top w:val="single" w:sz="2" w:space="12" w:color="auto"/>
+          <w:left w:val="single" w:sz="2" w:space="12" w:color="auto"/>
+          <w:bottom w:val="single" w:sz="2" w:space="12" w:color="auto"/>
+          <w:right w:val="single" w:sz="2" w:space="12" w:color="auto"/>
+        </w:pBdr>
+        <w:spacing w:before="120" w:after="120"/>
+        <w:rPr>
+          <w:rStyle w:val="CodeHTML"/>
+          <w:color w:val="383A42"/>
+          <w:spacing w:val="-4"/>
+          <w:bdr w:val="single" w:sz="2" w:space="0" w:color="auto" w:frame="1"/>
+        </w:rPr>
+      </w:pPr>
+      <w:r>
+        <w:rPr>
+          <w:rStyle w:val="CodeHTML"/>
+          <w:color w:val="383A42"/>
+          <w:spacing w:val="-4"/>
+          <w:bdr w:val="single" w:sz="2" w:space="0" w:color="auto" w:frame="1"/>
+        </w:rPr>
+        <w:t xml:space="preserve">Normalement </w:t>
+      </w:r>
+      <w:proofErr w:type="spellStart"/>
+      <w:r>
+        <w:rPr>
+          <w:rStyle w:val="CodeHTML"/>
+          <w:color w:val="383A42"/>
+          <w:spacing w:val="-4"/>
+          <w:bdr w:val="single" w:sz="2" w:space="0" w:color="auto" w:frame="1"/>
+        </w:rPr>
+        <w:t>celui ci</w:t>
+      </w:r>
+      <w:proofErr w:type="spellEnd"/>
+      <w:r>
+        <w:rPr>
+          <w:rStyle w:val="CodeHTML"/>
+          <w:color w:val="383A42"/>
+          <w:spacing w:val="-4"/>
+          <w:bdr w:val="single" w:sz="2" w:space="0" w:color="auto" w:frame="1"/>
+        </w:rPr>
+        <w:t xml:space="preserve"> peut rester </w:t>
+      </w:r>
+      <w:r>
+        <w:rPr>
+          <w:rStyle w:val="CodeHTML"/>
+          <w:color w:val="383A42"/>
+          <w:spacing w:val="-4"/>
+          <w:bdr w:val="single" w:sz="2" w:space="0" w:color="auto" w:frame="1"/>
+        </w:rPr>
+        <w:t>sur no je sais pas à quoi il sert</w:t>
+      </w:r>
+    </w:p>
+    <w:p>
+      <w:pPr>
+        <w:pStyle w:val="PrformatHTML"/>
+        <w:pBdr>
+          <w:top w:val="single" w:sz="2" w:space="12" w:color="auto"/>
+          <w:left w:val="single" w:sz="2" w:space="12" w:color="auto"/>
+          <w:bottom w:val="single" w:sz="2" w:space="12" w:color="auto"/>
+          <w:right w:val="single" w:sz="2" w:space="12" w:color="auto"/>
+        </w:pBdr>
+        <w:spacing w:before="120" w:after="120"/>
+        <w:rPr>
+          <w:color w:val="383A42"/>
+          <w:spacing w:val="-4"/>
+          <w:lang w:val="en-US"/>
+        </w:rPr>
+      </w:pPr>
+      <w:r>
+        <w:rPr>
+          <w:rStyle w:val="CodeHTML"/>
+          <w:color w:val="383A42"/>
+          <w:spacing w:val="-4"/>
+          <w:bdr w:val="single" w:sz="2" w:space="0" w:color="auto" w:frame="1"/>
+          <w:lang w:val="en-US"/>
+        </w:rPr>
+        <w:t>BACKLIGHT_ENABLE = no # Single-color LED backlight</w:t>
+      </w:r>
+    </w:p>
+    <w:p>
+      <w:pPr>
+        <w:pStyle w:val="PrformatHTML"/>
+        <w:pBdr>
+          <w:top w:val="single" w:sz="2" w:space="12" w:color="auto"/>
+          <w:left w:val="single" w:sz="2" w:space="12" w:color="auto"/>
+          <w:bottom w:val="single" w:sz="2" w:space="12" w:color="auto"/>
+          <w:right w:val="single" w:sz="2" w:space="12" w:color="auto"/>
+        </w:pBdr>
+        <w:spacing w:before="120" w:after="120"/>
+        <w:rPr>
+          <w:rStyle w:val="CodeHTML"/>
+          <w:color w:val="383A42"/>
+          <w:spacing w:val="-4"/>
+          <w:bdr w:val="single" w:sz="2" w:space="0" w:color="auto" w:frame="1"/>
+          <w:lang w:val="en-US"/>
+        </w:rPr>
+      </w:pPr>
+    </w:p>
+    <w:p>
+      <w:pPr>
+        <w:pStyle w:val="PrformatHTML"/>
+        <w:pBdr>
+          <w:top w:val="single" w:sz="2" w:space="12" w:color="auto"/>
+          <w:left w:val="single" w:sz="2" w:space="12" w:color="auto"/>
+          <w:bottom w:val="single" w:sz="2" w:space="12" w:color="auto"/>
+          <w:right w:val="single" w:sz="2" w:space="12" w:color="auto"/>
+        </w:pBdr>
+        <w:spacing w:before="120" w:after="120"/>
+        <w:rPr>
+          <w:color w:val="383A42"/>
+          <w:spacing w:val="-4"/>
+          <w:lang w:val="en-US"/>
+        </w:rPr>
+      </w:pPr>
+    </w:p>
+    <w:p>
+      <w:pPr>
+        <w:rPr>
+          <w:lang w:val="en-US"/>
+        </w:rPr>
+      </w:pPr>
+      <w:r>
+        <w:rPr>
+          <w:lang w:val="en-US"/>
+        </w:rPr>
+        <w:t xml:space="preserve">Et </w:t>
+      </w:r>
+      <w:proofErr w:type="spellStart"/>
+      <w:r>
+        <w:rPr>
+          <w:lang w:val="en-US"/>
+        </w:rPr>
+        <w:t>remplacé</w:t>
+      </w:r>
+      <w:proofErr w:type="spellEnd"/>
+    </w:p>
+    <w:p>
+      <w:pPr>
+        <w:pStyle w:val="PrformatHTML"/>
+        <w:pBdr>
+          <w:top w:val="single" w:sz="2" w:space="12" w:color="auto"/>
+          <w:left w:val="single" w:sz="2" w:space="12" w:color="auto"/>
+          <w:bottom w:val="single" w:sz="2" w:space="12" w:color="auto"/>
+          <w:right w:val="single" w:sz="2" w:space="12" w:color="auto"/>
+        </w:pBdr>
+        <w:spacing w:before="120" w:after="120"/>
+        <w:rPr>
+          <w:color w:val="383A42"/>
+          <w:spacing w:val="-4"/>
+          <w:lang w:val="en-US"/>
+        </w:rPr>
+      </w:pPr>
+      <w:r>
+        <w:rPr>
+          <w:rStyle w:val="CodeHTML"/>
+          <w:color w:val="383A42"/>
+          <w:spacing w:val="-4"/>
+          <w:bdr w:val="single" w:sz="2" w:space="0" w:color="auto" w:frame="1"/>
+          <w:lang w:val="en-US"/>
+        </w:rPr>
+        <w:t>"lighting": "</w:t>
+      </w:r>
+      <w:proofErr w:type="spellStart"/>
+      <w:r>
+        <w:rPr>
+          <w:rStyle w:val="CodeHTML"/>
+          <w:color w:val="383A42"/>
+          <w:spacing w:val="-4"/>
+          <w:bdr w:val="single" w:sz="2" w:space="0" w:color="auto" w:frame="1"/>
+          <w:lang w:val="en-US"/>
+        </w:rPr>
+        <w:t>vialrgb</w:t>
+      </w:r>
+      <w:proofErr w:type="spellEnd"/>
+      <w:r>
+        <w:rPr>
+          <w:rStyle w:val="CodeHTML"/>
+          <w:color w:val="383A42"/>
+          <w:spacing w:val="-4"/>
+          <w:bdr w:val="single" w:sz="2" w:space="0" w:color="auto" w:frame="1"/>
+          <w:lang w:val="en-US"/>
+        </w:rPr>
+        <w:t>",</w:t>
+      </w:r>
+    </w:p>
+    <w:p>
+      <w:pPr>
+        <w:rPr>
+          <w:lang w:val="en-US"/>
+        </w:rPr>
+      </w:pPr>
+      <w:r>
+        <w:rPr>
+          <w:lang w:val="en-US"/>
+        </w:rPr>
+        <w:t>Par</w:t>
+      </w:r>
+    </w:p>
+    <w:p>
+      <w:pPr>
+        <w:pStyle w:val="PrformatHTML"/>
+        <w:pBdr>
+          <w:top w:val="single" w:sz="2" w:space="12" w:color="auto"/>
+          <w:left w:val="single" w:sz="2" w:space="12" w:color="auto"/>
+          <w:bottom w:val="single" w:sz="2" w:space="12" w:color="auto"/>
+          <w:right w:val="single" w:sz="2" w:space="12" w:color="auto"/>
+        </w:pBdr>
+        <w:spacing w:before="120" w:after="120"/>
+        <w:rPr>
+          <w:color w:val="383A42"/>
+          <w:spacing w:val="-4"/>
+          <w:lang w:val="en-US"/>
+        </w:rPr>
+      </w:pPr>
+      <w:r>
+        <w:rPr>
+          <w:rStyle w:val="CodeHTML"/>
+          <w:color w:val="383A42"/>
+          <w:spacing w:val="-4"/>
+          <w:bdr w:val="single" w:sz="2" w:space="0" w:color="auto" w:frame="1"/>
+          <w:lang w:val="en-US"/>
+        </w:rPr>
+        <w:t xml:space="preserve">"lighting": "none" </w:t>
+      </w:r>
+    </w:p>
+    <w:p>
+      <w:r>
+        <w:t>Dans</w:t>
+      </w:r>
+      <w:r>
+        <w:t xml:space="preserve"> </w:t>
+      </w:r>
+      <w:proofErr w:type="spellStart"/>
+      <w:r>
+        <w:t>config.h</w:t>
+      </w:r>
+      <w:proofErr w:type="spellEnd"/>
+      <w:r>
+        <w:t xml:space="preserve"> i</w:t>
+      </w:r>
+      <w:r>
+        <w:t>l faudrait ajouter (à vérifier)</w:t>
+      </w:r>
+    </w:p>
+    <w:p>
+      <w:pPr>
+        <w:pStyle w:val="PrformatHTML"/>
+        <w:pBdr>
+          <w:top w:val="single" w:sz="2" w:space="12" w:color="auto"/>
+          <w:left w:val="single" w:sz="2" w:space="12" w:color="auto"/>
+          <w:bottom w:val="single" w:sz="2" w:space="12" w:color="auto"/>
+          <w:right w:val="single" w:sz="2" w:space="12" w:color="auto"/>
+        </w:pBdr>
+        <w:spacing w:before="120" w:after="120"/>
+        <w:rPr>
+          <w:rStyle w:val="CodeHTML"/>
+          <w:color w:val="383A42"/>
+          <w:spacing w:val="-4"/>
+          <w:bdr w:val="single" w:sz="2" w:space="0" w:color="auto" w:frame="1"/>
+          <w:lang w:val="en-US"/>
+        </w:rPr>
+      </w:pPr>
+      <w:r>
+        <w:rPr>
+          <w:rStyle w:val="CodeHTML"/>
+          <w:color w:val="383A42"/>
+          <w:spacing w:val="-4"/>
+          <w:bdr w:val="single" w:sz="2" w:space="0" w:color="auto" w:frame="1"/>
+          <w:lang w:val="en-US"/>
+        </w:rPr>
+        <w:t>// For RGB Matrix (per-key RGB)</w:t>
+      </w:r>
+    </w:p>
+    <w:p>
+      <w:pPr>
+        <w:pStyle w:val="PrformatHTML"/>
+        <w:pBdr>
+          <w:top w:val="single" w:sz="2" w:space="12" w:color="auto"/>
+          <w:left w:val="single" w:sz="2" w:space="12" w:color="auto"/>
+          <w:bottom w:val="single" w:sz="2" w:space="12" w:color="auto"/>
+          <w:right w:val="single" w:sz="2" w:space="12" w:color="auto"/>
+        </w:pBdr>
+        <w:spacing w:before="120" w:after="120"/>
+        <w:rPr>
+          <w:rStyle w:val="CodeHTML"/>
+          <w:color w:val="383A42"/>
+          <w:spacing w:val="-4"/>
+          <w:bdr w:val="single" w:sz="2" w:space="0" w:color="auto" w:frame="1"/>
+          <w:lang w:val="en-US"/>
+        </w:rPr>
+      </w:pPr>
+      <w:r>
+        <w:rPr>
+          <w:rStyle w:val="CodeHTML"/>
+          <w:color w:val="383A42"/>
+          <w:spacing w:val="-4"/>
+          <w:bdr w:val="single" w:sz="2" w:space="0" w:color="auto" w:frame="1"/>
+          <w:lang w:val="en-US"/>
+        </w:rPr>
+        <w:lastRenderedPageBreak/>
+        <w:t>#ifdef RGB_MATRIX_ENABLE</w:t>
+      </w:r>
+    </w:p>
+    <w:p>
+      <w:pPr>
+        <w:pStyle w:val="PrformatHTML"/>
+        <w:pBdr>
+          <w:top w:val="single" w:sz="2" w:space="12" w:color="auto"/>
+          <w:left w:val="single" w:sz="2" w:space="12" w:color="auto"/>
+          <w:bottom w:val="single" w:sz="2" w:space="12" w:color="auto"/>
+          <w:right w:val="single" w:sz="2" w:space="12" w:color="auto"/>
+        </w:pBdr>
+        <w:spacing w:before="120" w:after="120"/>
+        <w:rPr>
+          <w:rStyle w:val="CodeHTML"/>
+          <w:color w:val="383A42"/>
+          <w:spacing w:val="-4"/>
+          <w:bdr w:val="single" w:sz="2" w:space="0" w:color="auto" w:frame="1"/>
+          <w:lang w:val="en-US"/>
+        </w:rPr>
+      </w:pPr>
+      <w:r>
+        <w:rPr>
+          <w:rStyle w:val="CodeHTML"/>
+          <w:color w:val="383A42"/>
+          <w:spacing w:val="-4"/>
+          <w:bdr w:val="single" w:sz="2" w:space="0" w:color="auto" w:frame="1"/>
+          <w:lang w:val="en-US"/>
+        </w:rPr>
+        <w:t>#define VIAL_ENABLE_RGB_MATRIX</w:t>
+      </w:r>
+    </w:p>
+    <w:p>
+      <w:pPr>
+        <w:pStyle w:val="PrformatHTML"/>
+        <w:pBdr>
+          <w:top w:val="single" w:sz="2" w:space="12" w:color="auto"/>
+          <w:left w:val="single" w:sz="2" w:space="12" w:color="auto"/>
+          <w:bottom w:val="single" w:sz="2" w:space="12" w:color="auto"/>
+          <w:right w:val="single" w:sz="2" w:space="12" w:color="auto"/>
+        </w:pBdr>
+        <w:spacing w:before="120" w:after="120"/>
+        <w:rPr>
+          <w:rStyle w:val="CodeHTML"/>
+          <w:color w:val="383A42"/>
+          <w:spacing w:val="-4"/>
+          <w:bdr w:val="single" w:sz="2" w:space="0" w:color="auto" w:frame="1"/>
+          <w:lang w:val="en-US"/>
+        </w:rPr>
+      </w:pPr>
+      <w:r>
+        <w:rPr>
+          <w:rStyle w:val="CodeHTML"/>
+          <w:color w:val="383A42"/>
+          <w:spacing w:val="-4"/>
+          <w:bdr w:val="single" w:sz="2" w:space="0" w:color="auto" w:frame="1"/>
+          <w:lang w:val="en-US"/>
+        </w:rPr>
+        <w:t>#endif</w:t>
+      </w:r>
+    </w:p>
+    <w:p>
+      <w:pPr>
+        <w:pStyle w:val="PrformatHTML"/>
+        <w:pBdr>
+          <w:top w:val="single" w:sz="2" w:space="12" w:color="auto"/>
+          <w:left w:val="single" w:sz="2" w:space="12" w:color="auto"/>
+          <w:bottom w:val="single" w:sz="2" w:space="12" w:color="auto"/>
+          <w:right w:val="single" w:sz="2" w:space="12" w:color="auto"/>
+        </w:pBdr>
+        <w:spacing w:before="120" w:after="120"/>
+        <w:rPr>
+          <w:rStyle w:val="CodeHTML"/>
+          <w:color w:val="383A42"/>
+          <w:spacing w:val="-4"/>
+          <w:bdr w:val="single" w:sz="2" w:space="0" w:color="auto" w:frame="1"/>
+          <w:lang w:val="en-US"/>
+        </w:rPr>
+      </w:pPr>
+    </w:p>
+    <w:p>
+      <w:pPr>
+        <w:pStyle w:val="PrformatHTML"/>
+        <w:pBdr>
+          <w:top w:val="single" w:sz="2" w:space="12" w:color="auto"/>
+          <w:left w:val="single" w:sz="2" w:space="12" w:color="auto"/>
+          <w:bottom w:val="single" w:sz="2" w:space="12" w:color="auto"/>
+          <w:right w:val="single" w:sz="2" w:space="12" w:color="auto"/>
+        </w:pBdr>
+        <w:spacing w:before="120" w:after="120"/>
+        <w:rPr>
+          <w:rStyle w:val="CodeHTML"/>
+          <w:color w:val="383A42"/>
+          <w:spacing w:val="-4"/>
+          <w:bdr w:val="single" w:sz="2" w:space="0" w:color="auto" w:frame="1"/>
+          <w:lang w:val="en-US"/>
+        </w:rPr>
+      </w:pPr>
+      <w:r>
+        <w:rPr>
+          <w:rStyle w:val="CodeHTML"/>
+          <w:color w:val="383A42"/>
+          <w:spacing w:val="-4"/>
+          <w:bdr w:val="single" w:sz="2" w:space="0" w:color="auto" w:frame="1"/>
+          <w:lang w:val="en-US"/>
+        </w:rPr>
+        <w:t xml:space="preserve">// For </w:t>
+      </w:r>
+      <w:proofErr w:type="spellStart"/>
+      <w:r>
+        <w:rPr>
+          <w:rStyle w:val="CodeHTML"/>
+          <w:color w:val="383A42"/>
+          <w:spacing w:val="-4"/>
+          <w:bdr w:val="single" w:sz="2" w:space="0" w:color="auto" w:frame="1"/>
+          <w:lang w:val="en-US"/>
+        </w:rPr>
+        <w:t>RGBLight</w:t>
+      </w:r>
+      <w:proofErr w:type="spellEnd"/>
+      <w:r>
+        <w:rPr>
+          <w:rStyle w:val="CodeHTML"/>
+          <w:color w:val="383A42"/>
+          <w:spacing w:val="-4"/>
+          <w:bdr w:val="single" w:sz="2" w:space="0" w:color="auto" w:frame="1"/>
+          <w:lang w:val="en-US"/>
+        </w:rPr>
+        <w:t xml:space="preserve"> (</w:t>
+      </w:r>
+      <w:proofErr w:type="spellStart"/>
+      <w:r>
+        <w:rPr>
+          <w:rStyle w:val="CodeHTML"/>
+          <w:color w:val="383A42"/>
+          <w:spacing w:val="-4"/>
+          <w:bdr w:val="single" w:sz="2" w:space="0" w:color="auto" w:frame="1"/>
+          <w:lang w:val="en-US"/>
+        </w:rPr>
+        <w:t>underglow</w:t>
+      </w:r>
+      <w:proofErr w:type="spellEnd"/>
+      <w:r>
+        <w:rPr>
+          <w:rStyle w:val="CodeHTML"/>
+          <w:color w:val="383A42"/>
+          <w:spacing w:val="-4"/>
+          <w:bdr w:val="single" w:sz="2" w:space="0" w:color="auto" w:frame="1"/>
+          <w:lang w:val="en-US"/>
+        </w:rPr>
+        <w:t>)</w:t>
+      </w:r>
+    </w:p>
+    <w:p>
+      <w:pPr>
+        <w:pStyle w:val="PrformatHTML"/>
+        <w:pBdr>
+          <w:top w:val="single" w:sz="2" w:space="12" w:color="auto"/>
+          <w:left w:val="single" w:sz="2" w:space="12" w:color="auto"/>
+          <w:bottom w:val="single" w:sz="2" w:space="12" w:color="auto"/>
+          <w:right w:val="single" w:sz="2" w:space="12" w:color="auto"/>
+        </w:pBdr>
+        <w:spacing w:before="120" w:after="120"/>
+        <w:rPr>
+          <w:rStyle w:val="CodeHTML"/>
+          <w:color w:val="383A42"/>
+          <w:spacing w:val="-4"/>
+          <w:bdr w:val="single" w:sz="2" w:space="0" w:color="auto" w:frame="1"/>
+          <w:lang w:val="en-US"/>
+        </w:rPr>
+      </w:pPr>
+      <w:r>
+        <w:rPr>
+          <w:rStyle w:val="CodeHTML"/>
+          <w:color w:val="383A42"/>
+          <w:spacing w:val="-4"/>
+          <w:bdr w:val="single" w:sz="2" w:space="0" w:color="auto" w:frame="1"/>
+          <w:lang w:val="en-US"/>
+        </w:rPr>
+        <w:t>#ifdef RGBLIGHT_ENABLE</w:t>
+      </w:r>
+    </w:p>
+    <w:p>
+      <w:pPr>
+        <w:pStyle w:val="PrformatHTML"/>
+        <w:pBdr>
+          <w:top w:val="single" w:sz="2" w:space="12" w:color="auto"/>
+          <w:left w:val="single" w:sz="2" w:space="12" w:color="auto"/>
+          <w:bottom w:val="single" w:sz="2" w:space="12" w:color="auto"/>
+          <w:right w:val="single" w:sz="2" w:space="12" w:color="auto"/>
+        </w:pBdr>
+        <w:spacing w:before="120" w:after="120"/>
+        <w:rPr>
+          <w:rStyle w:val="CodeHTML"/>
+          <w:color w:val="383A42"/>
+          <w:spacing w:val="-4"/>
+          <w:bdr w:val="single" w:sz="2" w:space="0" w:color="auto" w:frame="1"/>
+          <w:lang w:val="en-US"/>
+        </w:rPr>
+      </w:pPr>
+      <w:r>
+        <w:rPr>
+          <w:rStyle w:val="CodeHTML"/>
+          <w:color w:val="383A42"/>
+          <w:spacing w:val="-4"/>
+          <w:bdr w:val="single" w:sz="2" w:space="0" w:color="auto" w:frame="1"/>
+          <w:lang w:val="en-US"/>
+        </w:rPr>
+        <w:t>#define VIAL_ENABLE_RGBLIGHT</w:t>
+      </w:r>
+    </w:p>
+    <w:p>
+      <w:pPr>
+        <w:pStyle w:val="PrformatHTML"/>
+        <w:pBdr>
+          <w:top w:val="single" w:sz="2" w:space="12" w:color="auto"/>
+          <w:left w:val="single" w:sz="2" w:space="12" w:color="auto"/>
+          <w:bottom w:val="single" w:sz="2" w:space="12" w:color="auto"/>
+          <w:right w:val="single" w:sz="2" w:space="12" w:color="auto"/>
+        </w:pBdr>
+        <w:spacing w:before="120" w:after="120"/>
+        <w:rPr>
+          <w:rStyle w:val="CodeHTML"/>
+          <w:color w:val="383A42"/>
+          <w:spacing w:val="-4"/>
+          <w:bdr w:val="single" w:sz="2" w:space="0" w:color="auto" w:frame="1"/>
+        </w:rPr>
+      </w:pPr>
+      <w:r>
+        <w:rPr>
+          <w:rStyle w:val="CodeHTML"/>
+          <w:color w:val="383A42"/>
+          <w:spacing w:val="-4"/>
+          <w:bdr w:val="single" w:sz="2" w:space="0" w:color="auto" w:frame="1"/>
+        </w:rPr>
+        <w:t>#endif</w:t>
+      </w:r>
+    </w:p>
+    <w:p>
+      <w:pPr>
+        <w:pStyle w:val="PrformatHTML"/>
+        <w:pBdr>
+          <w:top w:val="single" w:sz="2" w:space="12" w:color="auto"/>
+          <w:left w:val="single" w:sz="2" w:space="12" w:color="auto"/>
+          <w:bottom w:val="single" w:sz="2" w:space="12" w:color="auto"/>
+          <w:right w:val="single" w:sz="2" w:space="12" w:color="auto"/>
+        </w:pBdr>
+        <w:spacing w:before="120" w:after="120"/>
+        <w:rPr>
+          <w:rStyle w:val="CodeHTML"/>
+          <w:color w:val="383A42"/>
+          <w:spacing w:val="-4"/>
+          <w:bdr w:val="single" w:sz="2" w:space="0" w:color="auto" w:frame="1"/>
+        </w:rPr>
+      </w:pPr>
+      <w:r>
+        <w:rPr>
+          <w:rStyle w:val="CodeHTML"/>
+          <w:color w:val="383A42"/>
+          <w:spacing w:val="-4"/>
+          <w:bdr w:val="single" w:sz="2" w:space="0" w:color="auto" w:frame="1"/>
+        </w:rPr>
+        <w:t>/* Vial configuration -&gt; j’ai déjà ces variables donc</w:t>
+      </w:r>
+      <w:r>
+        <w:rPr>
+          <w:rStyle w:val="CodeHTML"/>
+          <w:color w:val="383A42"/>
+          <w:spacing w:val="-4"/>
+          <w:bdr w:val="single" w:sz="2" w:space="0" w:color="auto" w:frame="1"/>
+        </w:rPr>
+        <w:t xml:space="preserve"> cette partie semble à retirer</w:t>
+      </w:r>
+    </w:p>
+    <w:p>
+      <w:pPr>
+        <w:pStyle w:val="PrformatHTML"/>
+        <w:pBdr>
+          <w:top w:val="single" w:sz="2" w:space="12" w:color="auto"/>
+          <w:left w:val="single" w:sz="2" w:space="12" w:color="auto"/>
+          <w:bottom w:val="single" w:sz="2" w:space="12" w:color="auto"/>
+          <w:right w:val="single" w:sz="2" w:space="12" w:color="auto"/>
+        </w:pBdr>
+        <w:spacing w:before="120" w:after="120"/>
+        <w:rPr>
+          <w:rStyle w:val="CodeHTML"/>
+          <w:color w:val="383A42"/>
+          <w:spacing w:val="-4"/>
+          <w:bdr w:val="single" w:sz="2" w:space="0" w:color="auto" w:frame="1"/>
+          <w:lang w:val="en-US"/>
+        </w:rPr>
+      </w:pPr>
+      <w:r>
+        <w:rPr>
+          <w:rStyle w:val="CodeHTML"/>
+          <w:color w:val="383A42"/>
+          <w:spacing w:val="-4"/>
+          <w:bdr w:val="single" w:sz="2" w:space="0" w:color="auto" w:frame="1"/>
+          <w:lang w:val="en-US"/>
+        </w:rPr>
+        <w:t>#define VIAL_KEYBOARD_UID {0xCA, 0x50, 0xE9, 0x65, 0x0B, 0xB3, 0xAF, 0x7E}</w:t>
+      </w:r>
+    </w:p>
+    <w:p>
+      <w:pPr>
+        <w:pStyle w:val="PrformatHTML"/>
+        <w:pBdr>
+          <w:top w:val="single" w:sz="2" w:space="12" w:color="auto"/>
+          <w:left w:val="single" w:sz="2" w:space="12" w:color="auto"/>
+          <w:bottom w:val="single" w:sz="2" w:space="12" w:color="auto"/>
+          <w:right w:val="single" w:sz="2" w:space="12" w:color="auto"/>
+        </w:pBdr>
+        <w:spacing w:before="120" w:after="120"/>
+        <w:rPr>
+          <w:rStyle w:val="CodeHTML"/>
+          <w:color w:val="383A42"/>
+          <w:spacing w:val="-4"/>
+          <w:bdr w:val="single" w:sz="2" w:space="0" w:color="auto" w:frame="1"/>
+          <w:lang w:val="en-US"/>
+        </w:rPr>
+      </w:pPr>
+      <w:r>
+        <w:rPr>
+          <w:rStyle w:val="CodeHTML"/>
+          <w:color w:val="383A42"/>
+          <w:spacing w:val="-4"/>
+          <w:bdr w:val="single" w:sz="2" w:space="0" w:color="auto" w:frame="1"/>
+          <w:lang w:val="en-US"/>
+        </w:rPr>
+        <w:t>#define VIAL_UNLOCK_COMBO_ROWS { 0, 0 }</w:t>
+      </w:r>
+    </w:p>
+    <w:p>
+      <w:pPr>
+        <w:pStyle w:val="PrformatHTML"/>
+        <w:pBdr>
+          <w:top w:val="single" w:sz="2" w:space="12" w:color="auto"/>
+          <w:left w:val="single" w:sz="2" w:space="12" w:color="auto"/>
+          <w:bottom w:val="single" w:sz="2" w:space="12" w:color="auto"/>
+          <w:right w:val="single" w:sz="2" w:space="12" w:color="auto"/>
+        </w:pBdr>
+        <w:spacing w:before="120" w:after="120"/>
+        <w:rPr>
+          <w:rStyle w:val="CodeHTML"/>
+          <w:color w:val="383A42"/>
+          <w:spacing w:val="-4"/>
+          <w:bdr w:val="single" w:sz="2" w:space="0" w:color="auto" w:frame="1"/>
+          <w:lang w:val="en-US"/>
+        </w:rPr>
+      </w:pPr>
+      <w:r>
+        <w:rPr>
+          <w:rStyle w:val="CodeHTML"/>
+          <w:color w:val="383A42"/>
+          <w:spacing w:val="-4"/>
+          <w:bdr w:val="single" w:sz="2" w:space="0" w:color="auto" w:frame="1"/>
+          <w:lang w:val="en-US"/>
+        </w:rPr>
+        <w:t>#define VIAL_UNLOCK_COMBO_COLS { 0, 1 }</w:t>
+      </w:r>
+    </w:p>
+    <w:p>
+      <w:pPr>
+        <w:pStyle w:val="PrformatHTML"/>
+        <w:pBdr>
+          <w:top w:val="single" w:sz="2" w:space="12" w:color="auto"/>
+          <w:left w:val="single" w:sz="2" w:space="12" w:color="auto"/>
+          <w:bottom w:val="single" w:sz="2" w:space="12" w:color="auto"/>
+          <w:right w:val="single" w:sz="2" w:space="12" w:color="auto"/>
+        </w:pBdr>
+        <w:spacing w:before="120" w:after="120"/>
+        <w:rPr>
+          <w:rStyle w:val="CodeHTML"/>
+          <w:color w:val="383A42"/>
+          <w:spacing w:val="-4"/>
+          <w:bdr w:val="single" w:sz="2" w:space="0" w:color="auto" w:frame="1"/>
+          <w:lang w:val="en-US"/>
+        </w:rPr>
+      </w:pPr>
+      <w:r>
+        <w:rPr>
+          <w:rStyle w:val="CodeHTML"/>
+          <w:color w:val="383A42"/>
+          <w:spacing w:val="-4"/>
+          <w:bdr w:val="single" w:sz="2" w:space="0" w:color="auto" w:frame="1"/>
+          <w:lang w:val="en-US"/>
+        </w:rPr>
+        <w:t>*/</w:t>
+      </w:r>
+    </w:p>
+    <w:p>
+      <w:pPr>
+        <w:pStyle w:val="PrformatHTML"/>
+        <w:pBdr>
+          <w:top w:val="single" w:sz="2" w:space="12" w:color="auto"/>
+          <w:left w:val="single" w:sz="2" w:space="12" w:color="auto"/>
+          <w:bottom w:val="single" w:sz="2" w:space="12" w:color="auto"/>
+          <w:right w:val="single" w:sz="2" w:space="12" w:color="auto"/>
+        </w:pBdr>
+        <w:spacing w:before="120" w:after="120"/>
+        <w:rPr>
+          <w:rStyle w:val="CodeHTML"/>
+          <w:color w:val="383A42"/>
+          <w:spacing w:val="-4"/>
+          <w:bdr w:val="single" w:sz="2" w:space="0" w:color="auto" w:frame="1"/>
+          <w:lang w:val="en-US"/>
+        </w:rPr>
+      </w:pPr>
+    </w:p>
+    <w:p>
+      <w:pPr>
+        <w:pStyle w:val="PrformatHTML"/>
+        <w:pBdr>
+          <w:top w:val="single" w:sz="2" w:space="12" w:color="auto"/>
+          <w:left w:val="single" w:sz="2" w:space="12" w:color="auto"/>
+          <w:bottom w:val="single" w:sz="2" w:space="12" w:color="auto"/>
+          <w:right w:val="single" w:sz="2" w:space="12" w:color="auto"/>
+        </w:pBdr>
+        <w:spacing w:before="120" w:after="120"/>
+        <w:rPr>
+          <w:rStyle w:val="CodeHTML"/>
+          <w:color w:val="383A42"/>
+          <w:spacing w:val="-4"/>
+          <w:bdr w:val="single" w:sz="2" w:space="0" w:color="auto" w:frame="1"/>
+          <w:lang w:val="en-US"/>
+        </w:rPr>
+      </w:pPr>
+      <w:r>
+        <w:rPr>
+          <w:rStyle w:val="CodeHTML"/>
+          <w:color w:val="383A42"/>
+          <w:spacing w:val="-4"/>
+          <w:bdr w:val="single" w:sz="2" w:space="0" w:color="auto" w:frame="1"/>
+          <w:lang w:val="en-US"/>
+        </w:rPr>
+        <w:t>/* Enable Vial RGB support */</w:t>
+      </w:r>
+    </w:p>
+    <w:p>
+      <w:pPr>
+        <w:pStyle w:val="PrformatHTML"/>
+        <w:pBdr>
+          <w:top w:val="single" w:sz="2" w:space="12" w:color="auto"/>
+          <w:left w:val="single" w:sz="2" w:space="12" w:color="auto"/>
+          <w:bottom w:val="single" w:sz="2" w:space="12" w:color="auto"/>
+          <w:right w:val="single" w:sz="2" w:space="12" w:color="auto"/>
+        </w:pBdr>
+        <w:spacing w:before="120" w:after="120"/>
+        <w:rPr>
+          <w:color w:val="383A42"/>
+          <w:spacing w:val="-4"/>
+          <w:lang w:val="en-US"/>
+        </w:rPr>
+      </w:pPr>
+      <w:r>
+        <w:rPr>
+          <w:rStyle w:val="CodeHTML"/>
+          <w:color w:val="383A42"/>
+          <w:spacing w:val="-4"/>
+          <w:bdr w:val="single" w:sz="2" w:space="0" w:color="auto" w:frame="1"/>
+          <w:lang w:val="en-US"/>
+        </w:rPr>
+        <w:t>#define VIALRGB_ENABLE</w:t>
+      </w:r>
+    </w:p>
+    <w:p>
+      <w:pPr>
+        <w:pStyle w:val="PrformatHTML"/>
+        <w:pBdr>
+          <w:top w:val="single" w:sz="2" w:space="12" w:color="auto"/>
+          <w:left w:val="single" w:sz="2" w:space="12" w:color="auto"/>
+          <w:bottom w:val="single" w:sz="2" w:space="12" w:color="auto"/>
+          <w:right w:val="single" w:sz="2" w:space="12" w:color="auto"/>
+        </w:pBdr>
+        <w:spacing w:before="120" w:after="120"/>
+        <w:rPr>
+          <w:color w:val="383A42"/>
+          <w:spacing w:val="-4"/>
+          <w:lang w:val="en-US"/>
+        </w:rPr>
+      </w:pPr>
+    </w:p>
+    <w:p>
+      <w:pPr>
+        <w:rPr>
+          <w:lang w:val="en-US"/>
+        </w:rPr>
+      </w:pPr>
+    </w:p>
+    <w:sectPr>
+      <w:pgSz w:w="11906" w:h="16838"/>
+      <w:pgMar w:top="1417" w:right="1417" w:bottom="1417" w:left="1417" w:header="708" w:footer="708" w:gutter="0"/>
+      <w:cols w:space="708"/>
+      <w:docGrid w:linePitch="360"/>
+    </w:sectPr>
+  </w:body>
+</w:document>
+</file>
 
 <file path=word/styles.xml><?xml version="1.0" encoding="utf-8"?>
 <w:styles xmlns:mc="http://schemas.openxmlformats.org/markup-compatibility/2006" xmlns:r="http://schemas.openxmlformats.org/officeDocument/2006/relationships" xmlns:w="http://schemas.openxmlformats.org/wordprocessingml/2006/main" xmlns:w14="http://schemas.microsoft.com/office/word/2010/wordml" xmlns:w15="http://schemas.microsoft.com/office/word/2012/wordml" xmlns:w16cex="http://schemas.microsoft.com/office/word/2018/wordml/cex" xmlns:w16cid="http://schemas.microsoft.com/office/word/2016/wordml/cid" xmlns:w16="http://schemas.microsoft.com/office/word/2018/wordml" xmlns:w16sdtdh="http://schemas.microsoft.com/office/word/2020/wordml/sdtdatahash" xmlns:w16se="http://schemas.microsoft.com/office/word/2015/wordml/symex" mc:Ignorable="w14 w15 w16se w16cid w16 w16cex w16sdtdh">

</xml_diff>